<commit_message>
Add submission-ready IEEE 830 SRS deliverables in PDF and DOCX for Adarsh Dubey (2400320100061)
</commit_message>
<xml_diff>
--- a/deliverables/Project_Brief_Adarsh_Dubey_2400320100061.docx
+++ b/deliverables/Project_Brief_Adarsh_Dubey_2400320100061.docx
@@ -174,14 +174,6 @@
         </w:tc>
       </w:tr>
       <w:tr>
-        <w:tblPrEx>
-          <w:tblCellMar>
-            <w:top w:w="0" w:type="dxa"/>
-            <w:left w:w="108" w:type="dxa"/>
-            <w:bottom w:w="0" w:type="dxa"/>
-            <w:right w:w="108" w:type="dxa"/>
-          </w:tblCellMar>
-        </w:tblPrEx>
         <w:trPr>
           <w:jc w:val="center"/>
         </w:trPr>
@@ -225,6 +217,492 @@
               </w:rPr>
               <w:t>Project 81</w:t>
             </w:r>
+          </w:p>
+        </w:tc>
+      </w:tr>
+      <w:tr>
+        <w:trPr>
+          <w:jc w:val="center"/>
+        </w:trPr>
+        <w:tc>
+          <w:tcPr>
+            <w:tcW w:w="5040" w:type="dxa"/>
+            <w:shd w:val="clear" w:color="auto" w:fill="FFFFFF"/>
+            <w:tcMar>
+              <w:top w:w="45" w:type="dxa"/>
+              <w:left w:w="80" w:type="dxa"/>
+              <w:bottom w:w="45" w:type="dxa"/>
+              <w:right w:w="80" w:type="dxa"/>
+            </w:tcMar>
+          </w:tcPr>
+          <w:p>
+            <w:r>
+              <w:rPr>
+                <w:b/>
+                <w:color w:val="311465"/>
+                <w:sz w:val="16"/>
+              </w:rPr>
+              <w:t>Specialization Domain</w:t>
+            </w:r>
+          </w:p>
+        </w:tc>
+        <w:tc>
+          <w:tcPr>
+            <w:tcW w:w="5040" w:type="dxa"/>
+            <w:shd w:val="clear" w:color="auto" w:fill="FFFFFF"/>
+            <w:tcMar>
+              <w:top w:w="45" w:type="dxa"/>
+              <w:left w:w="80" w:type="dxa"/>
+              <w:bottom w:w="45" w:type="dxa"/>
+              <w:right w:w="80" w:type="dxa"/>
+            </w:tcMar>
+          </w:tcPr>
+          <w:p>
+            <w:r>
+              <w:rPr>
+                <w:sz w:val="16"/>
+              </w:rPr>
+              <w:t>Agentic AI / Python (Intelligent Autonomous Systems Track)</w:t>
+            </w:r>
+          </w:p>
+        </w:tc>
+      </w:tr>
+      <w:tr>
+        <w:trPr>
+          <w:jc w:val="center"/>
+        </w:trPr>
+        <w:tc>
+          <w:tcPr>
+            <w:tcW w:w="5040" w:type="dxa"/>
+            <w:shd w:val="clear" w:color="auto" w:fill="F8FAFC"/>
+            <w:tcMar>
+              <w:top w:w="45" w:type="dxa"/>
+              <w:left w:w="80" w:type="dxa"/>
+              <w:bottom w:w="45" w:type="dxa"/>
+              <w:right w:w="80" w:type="dxa"/>
+            </w:tcMar>
+          </w:tcPr>
+          <w:p>
+            <w:r>
+              <w:rPr>
+                <w:b/>
+                <w:color w:val="311465"/>
+                <w:sz w:val="16"/>
+              </w:rPr>
+              <w:t>Learner / Candidate Name</w:t>
+            </w:r>
+          </w:p>
+        </w:tc>
+        <w:tc>
+          <w:tcPr>
+            <w:tcW w:w="5040" w:type="dxa"/>
+            <w:shd w:val="clear" w:color="auto" w:fill="F8FAFC"/>
+            <w:tcMar>
+              <w:top w:w="45" w:type="dxa"/>
+              <w:left w:w="80" w:type="dxa"/>
+              <w:bottom w:w="45" w:type="dxa"/>
+              <w:right w:w="80" w:type="dxa"/>
+            </w:tcMar>
+          </w:tcPr>
+          <w:p>
+            <w:r>
+              <w:rPr>
+                <w:sz w:val="16"/>
+              </w:rPr>
+              <w:t>Adarsh Dubey</w:t>
+            </w:r>
+          </w:p>
+        </w:tc>
+      </w:tr>
+      <w:tr>
+        <w:trPr>
+          <w:jc w:val="center"/>
+        </w:trPr>
+        <w:tc>
+          <w:tcPr>
+            <w:tcW w:w="5040" w:type="dxa"/>
+            <w:shd w:val="clear" w:color="auto" w:fill="FFFFFF"/>
+            <w:tcMar>
+              <w:top w:w="45" w:type="dxa"/>
+              <w:left w:w="80" w:type="dxa"/>
+              <w:bottom w:w="45" w:type="dxa"/>
+              <w:right w:w="80" w:type="dxa"/>
+            </w:tcMar>
+          </w:tcPr>
+          <w:p>
+            <w:r>
+              <w:rPr>
+                <w:b/>
+                <w:color w:val="311465"/>
+                <w:sz w:val="16"/>
+              </w:rPr>
+              <w:t>University Roll Number</w:t>
+            </w:r>
+          </w:p>
+        </w:tc>
+        <w:tc>
+          <w:tcPr>
+            <w:tcW w:w="5040" w:type="dxa"/>
+            <w:shd w:val="clear" w:color="auto" w:fill="FFFFFF"/>
+            <w:tcMar>
+              <w:top w:w="45" w:type="dxa"/>
+              <w:left w:w="80" w:type="dxa"/>
+              <w:bottom w:w="45" w:type="dxa"/>
+              <w:right w:w="80" w:type="dxa"/>
+            </w:tcMar>
+          </w:tcPr>
+          <w:p>
+            <w:r>
+              <w:rPr>
+                <w:sz w:val="16"/>
+              </w:rPr>
+              <w:t>2400320100061</w:t>
+            </w:r>
+          </w:p>
+        </w:tc>
+      </w:tr>
+      <w:tr>
+        <w:trPr>
+          <w:jc w:val="center"/>
+        </w:trPr>
+        <w:tc>
+          <w:tcPr>
+            <w:tcW w:w="5040" w:type="dxa"/>
+            <w:shd w:val="clear" w:color="auto" w:fill="F8FAFC"/>
+            <w:tcMar>
+              <w:top w:w="45" w:type="dxa"/>
+              <w:left w:w="80" w:type="dxa"/>
+              <w:bottom w:w="45" w:type="dxa"/>
+              <w:right w:w="80" w:type="dxa"/>
+            </w:tcMar>
+          </w:tcPr>
+          <w:p>
+            <w:r>
+              <w:rPr>
+                <w:b/>
+                <w:color w:val="311465"/>
+                <w:sz w:val="16"/>
+              </w:rPr>
+              <w:t>Academic Institution</w:t>
+            </w:r>
+          </w:p>
+        </w:tc>
+        <w:tc>
+          <w:tcPr>
+            <w:tcW w:w="5040" w:type="dxa"/>
+            <w:shd w:val="clear" w:color="auto" w:fill="F8FAFC"/>
+            <w:tcMar>
+              <w:top w:w="45" w:type="dxa"/>
+              <w:left w:w="80" w:type="dxa"/>
+              <w:bottom w:w="45" w:type="dxa"/>
+              <w:right w:w="80" w:type="dxa"/>
+            </w:tcMar>
+          </w:tcPr>
+          <w:p>
+            <w:r>
+              <w:rPr>
+                <w:sz w:val="16"/>
+              </w:rPr>
+              <w:t>ABES Engineering College, Ghaziabad (Dept. of CSE)</w:t>
+            </w:r>
+          </w:p>
+        </w:tc>
+      </w:tr>
+      <w:tr>
+        <w:trPr>
+          <w:jc w:val="center"/>
+        </w:trPr>
+        <w:tc>
+          <w:tcPr>
+            <w:tcW w:w="5040" w:type="dxa"/>
+            <w:shd w:val="clear" w:color="auto" w:fill="FFFFFF"/>
+            <w:tcMar>
+              <w:top w:w="45" w:type="dxa"/>
+              <w:left w:w="80" w:type="dxa"/>
+              <w:bottom w:w="45" w:type="dxa"/>
+              <w:right w:w="80" w:type="dxa"/>
+            </w:tcMar>
+          </w:tcPr>
+          <w:p>
+            <w:r>
+              <w:rPr>
+                <w:b/>
+                <w:color w:val="311465"/>
+                <w:sz w:val="16"/>
+              </w:rPr>
+              <w:t>Industry Project Mentor</w:t>
+            </w:r>
+          </w:p>
+        </w:tc>
+        <w:tc>
+          <w:tcPr>
+            <w:tcW w:w="5040" w:type="dxa"/>
+            <w:shd w:val="clear" w:color="auto" w:fill="FFFFFF"/>
+            <w:tcMar>
+              <w:top w:w="45" w:type="dxa"/>
+              <w:left w:w="80" w:type="dxa"/>
+              <w:bottom w:w="45" w:type="dxa"/>
+              <w:right w:w="80" w:type="dxa"/>
+            </w:tcMar>
+          </w:tcPr>
+          <w:p>
+            <w:r>
+              <w:rPr>
+                <w:sz w:val="16"/>
+              </w:rPr>
+              <w:t>Radhika Singhal (HCLTech Career Shaper Mentor)</w:t>
+            </w:r>
+          </w:p>
+        </w:tc>
+      </w:tr>
+      <w:tr>
+        <w:trPr>
+          <w:jc w:val="center"/>
+        </w:trPr>
+        <w:tc>
+          <w:tcPr>
+            <w:tcW w:w="5040" w:type="dxa"/>
+            <w:shd w:val="clear" w:color="auto" w:fill="F8FAFC"/>
+            <w:tcMar>
+              <w:top w:w="45" w:type="dxa"/>
+              <w:left w:w="80" w:type="dxa"/>
+              <w:bottom w:w="45" w:type="dxa"/>
+              <w:right w:w="80" w:type="dxa"/>
+            </w:tcMar>
+          </w:tcPr>
+          <w:p>
+            <w:r>
+              <w:rPr>
+                <w:b/>
+                <w:color w:val="311465"/>
+                <w:sz w:val="16"/>
+              </w:rPr>
+              <w:t>Core Technology Stack</w:t>
+            </w:r>
+          </w:p>
+        </w:tc>
+        <w:tc>
+          <w:tcPr>
+            <w:tcW w:w="5040" w:type="dxa"/>
+            <w:shd w:val="clear" w:color="auto" w:fill="F8FAFC"/>
+            <w:tcMar>
+              <w:top w:w="45" w:type="dxa"/>
+              <w:left w:w="80" w:type="dxa"/>
+              <w:bottom w:w="45" w:type="dxa"/>
+              <w:right w:w="80" w:type="dxa"/>
+            </w:tcMar>
+          </w:tcPr>
+          <w:p>
+            <w:r>
+              <w:rPr>
+                <w:sz w:val="16"/>
+              </w:rPr>
+              <w:t>Python 3.11+, LangChain, LangGraph, Gemini 2.5 Flash, Trafilatura, Pydantic v2, Streamlit, Plotly</w:t>
+            </w:r>
+          </w:p>
+        </w:tc>
+      </w:tr>
+      <w:tr>
+        <w:trPr>
+          <w:jc w:val="center"/>
+        </w:trPr>
+        <w:tc>
+          <w:tcPr>
+            <w:tcW w:w="5040" w:type="dxa"/>
+            <w:shd w:val="clear" w:color="auto" w:fill="FFFFFF"/>
+            <w:tcMar>
+              <w:top w:w="45" w:type="dxa"/>
+              <w:left w:w="80" w:type="dxa"/>
+              <w:bottom w:w="45" w:type="dxa"/>
+              <w:right w:w="80" w:type="dxa"/>
+            </w:tcMar>
+          </w:tcPr>
+          <w:p>
+            <w:r>
+              <w:rPr>
+                <w:b/>
+                <w:color w:val="311465"/>
+                <w:sz w:val="16"/>
+              </w:rPr>
+              <w:t>Difficulty / Duration</w:t>
+            </w:r>
+          </w:p>
+        </w:tc>
+        <w:tc>
+          <w:tcPr>
+            <w:tcW w:w="5040" w:type="dxa"/>
+            <w:shd w:val="clear" w:color="auto" w:fill="FFFFFF"/>
+            <w:tcMar>
+              <w:top w:w="45" w:type="dxa"/>
+              <w:left w:w="80" w:type="dxa"/>
+              <w:bottom w:w="45" w:type="dxa"/>
+              <w:right w:w="80" w:type="dxa"/>
+            </w:tcMar>
+          </w:tcPr>
+          <w:p>
+            <w:r>
+              <w:rPr>
+                <w:sz w:val="16"/>
+              </w:rPr>
+              <w:t>Intermediate to Advanced Capstone | 4 Weeks (Sprint-based)</w:t>
+            </w:r>
+          </w:p>
+        </w:tc>
+      </w:tr>
+      <w:tr>
+        <w:trPr>
+          <w:jc w:val="center"/>
+        </w:trPr>
+        <w:tc>
+          <w:tcPr>
+            <w:tcW w:w="5040" w:type="dxa"/>
+            <w:shd w:val="clear" w:color="auto" w:fill="F8FAFC"/>
+            <w:tcMar>
+              <w:top w:w="45" w:type="dxa"/>
+              <w:left w:w="80" w:type="dxa"/>
+              <w:bottom w:w="45" w:type="dxa"/>
+              <w:right w:w="80" w:type="dxa"/>
+            </w:tcMar>
+          </w:tcPr>
+          <w:p>
+            <w:pPr>
+              <w:rPr>
+                <w:b/>
+                <w:color w:val="311465"/>
+                <w:sz w:val="16"/>
+              </w:rPr>
+            </w:pPr>
+            <w:r>
+              <w:rPr>
+                <w:b/>
+                <w:color w:val="311465"/>
+                <w:sz w:val="16"/>
+              </w:rPr>
+              <w:t>GitHub Repository</w:t>
+            </w:r>
+          </w:p>
+          <w:p>
+            <w:pPr>
+              <w:rPr>
+                <w:rFonts w:hint="default"/>
+                <w:b/>
+                <w:color w:val="311465"/>
+                <w:sz w:val="16"/>
+                <w:lang w:val="en-US"/>
+              </w:rPr>
+            </w:pPr>
+            <w:r>
+              <w:rPr>
+                <w:rFonts w:hint="default"/>
+                <w:b/>
+                <w:color w:val="311465"/>
+                <w:sz w:val="16"/>
+                <w:lang w:val="en-US"/>
+              </w:rPr>
+              <w:t>Deployed Link</w:t>
+            </w:r>
+          </w:p>
+        </w:tc>
+        <w:tc>
+          <w:tcPr>
+            <w:tcW w:w="5040" w:type="dxa"/>
+            <w:shd w:val="clear" w:color="auto" w:fill="F8FAFC"/>
+            <w:tcMar>
+              <w:top w:w="45" w:type="dxa"/>
+              <w:left w:w="80" w:type="dxa"/>
+              <w:bottom w:w="45" w:type="dxa"/>
+              <w:right w:w="80" w:type="dxa"/>
+            </w:tcMar>
+          </w:tcPr>
+          <w:p>
+            <w:pPr>
+              <w:rPr>
+                <w:sz w:val="16"/>
+              </w:rPr>
+            </w:pPr>
+            <w:r>
+              <w:rPr>
+                <w:sz w:val="16"/>
+              </w:rPr>
+              <w:fldChar w:fldCharType="begin"/>
+            </w:r>
+            <w:r>
+              <w:rPr>
+                <w:sz w:val="16"/>
+              </w:rPr>
+              <w:instrText xml:space="preserve"> HYPERLINK "https://github.com/adarsh-dubey-gthb/hcl-marketanalyzer.git" </w:instrText>
+            </w:r>
+            <w:r>
+              <w:rPr>
+                <w:sz w:val="16"/>
+              </w:rPr>
+              <w:fldChar w:fldCharType="separate"/>
+            </w:r>
+            <w:r>
+              <w:rPr>
+                <w:rStyle w:val="20"/>
+                <w:sz w:val="16"/>
+              </w:rPr>
+              <w:t>https://github.com/adarsh-dubey-gthb/hcl-marketanalyzer.git</w:t>
+            </w:r>
+            <w:r>
+              <w:rPr>
+                <w:sz w:val="16"/>
+              </w:rPr>
+              <w:fldChar w:fldCharType="end"/>
+            </w:r>
+          </w:p>
+          <w:p>
+            <w:pPr>
+              <w:rPr>
+                <w:rFonts w:ascii="SimSun" w:hAnsi="SimSun" w:eastAsia="SimSun" w:cs="SimSun"/>
+                <w:sz w:val="24"/>
+                <w:szCs w:val="24"/>
+              </w:rPr>
+            </w:pPr>
+            <w:r>
+              <w:rPr>
+                <w:rFonts w:ascii="SimSun" w:hAnsi="SimSun" w:eastAsia="SimSun" w:cs="SimSun"/>
+                <w:sz w:val="24"/>
+                <w:szCs w:val="24"/>
+              </w:rPr>
+              <w:fldChar w:fldCharType="begin"/>
+            </w:r>
+            <w:r>
+              <w:rPr>
+                <w:rFonts w:ascii="SimSun" w:hAnsi="SimSun" w:eastAsia="SimSun" w:cs="SimSun"/>
+                <w:sz w:val="24"/>
+                <w:szCs w:val="24"/>
+              </w:rPr>
+              <w:instrText xml:space="preserve"> HYPERLINK "https://hcl-marketanalyzer-jch.streamlit.app/" </w:instrText>
+            </w:r>
+            <w:r>
+              <w:rPr>
+                <w:rFonts w:ascii="SimSun" w:hAnsi="SimSun" w:eastAsia="SimSun" w:cs="SimSun"/>
+                <w:sz w:val="24"/>
+                <w:szCs w:val="24"/>
+              </w:rPr>
+              <w:fldChar w:fldCharType="separate"/>
+            </w:r>
+            <w:r>
+              <w:rPr>
+                <w:rStyle w:val="20"/>
+                <w:rFonts w:ascii="SimSun" w:hAnsi="SimSun" w:eastAsia="SimSun" w:cs="SimSun"/>
+                <w:sz w:val="24"/>
+                <w:szCs w:val="24"/>
+              </w:rPr>
+              <w:t>https://hcl-marketanalyzer-jch.streamlit.app/</w:t>
+            </w:r>
+            <w:r>
+              <w:rPr>
+                <w:rFonts w:ascii="SimSun" w:hAnsi="SimSun" w:eastAsia="SimSun" w:cs="SimSun"/>
+                <w:sz w:val="24"/>
+                <w:szCs w:val="24"/>
+              </w:rPr>
+              <w:fldChar w:fldCharType="end"/>
+            </w:r>
+            <w:bookmarkStart w:id="0" w:name="_GoBack"/>
+            <w:bookmarkEnd w:id="0"/>
           </w:p>
         </w:tc>
       </w:tr>
@@ -258,7 +736,7 @@
                 <w:color w:val="311465"/>
                 <w:sz w:val="16"/>
               </w:rPr>
-              <w:t>Specialization Domain</w:t>
+              <w:t>Submission Format &amp; Scope</w:t>
             </w:r>
           </w:p>
         </w:tc>
@@ -278,7 +756,7 @@
               <w:rPr>
                 <w:sz w:val="16"/>
               </w:rPr>
-              <w:t>Agentic AI / Python (Intelligent Autonomous Systems Track)</w:t>
+              <w:t>Individual Comprehensive Project Deliverable (1 Learner)</w:t>
             </w:r>
           </w:p>
         </w:tc>
@@ -313,7 +791,7 @@
                 <w:color w:val="311465"/>
                 <w:sz w:val="16"/>
               </w:rPr>
-              <w:t>Learner / Candidate Name</w:t>
+              <w:t>Academic Session</w:t>
             </w:r>
           </w:p>
         </w:tc>
@@ -333,446 +811,6 @@
               <w:rPr>
                 <w:sz w:val="16"/>
               </w:rPr>
-              <w:t>Adarsh Dubey</w:t>
-            </w:r>
-          </w:p>
-        </w:tc>
-      </w:tr>
-      <w:tr>
-        <w:tblPrEx>
-          <w:tblCellMar>
-            <w:top w:w="0" w:type="dxa"/>
-            <w:left w:w="108" w:type="dxa"/>
-            <w:bottom w:w="0" w:type="dxa"/>
-            <w:right w:w="108" w:type="dxa"/>
-          </w:tblCellMar>
-        </w:tblPrEx>
-        <w:trPr>
-          <w:jc w:val="center"/>
-        </w:trPr>
-        <w:tc>
-          <w:tcPr>
-            <w:tcW w:w="5040" w:type="dxa"/>
-            <w:shd w:val="clear" w:color="auto" w:fill="FFFFFF"/>
-            <w:tcMar>
-              <w:top w:w="45" w:type="dxa"/>
-              <w:left w:w="80" w:type="dxa"/>
-              <w:bottom w:w="45" w:type="dxa"/>
-              <w:right w:w="80" w:type="dxa"/>
-            </w:tcMar>
-          </w:tcPr>
-          <w:p>
-            <w:r>
-              <w:rPr>
-                <w:b/>
-                <w:color w:val="311465"/>
-                <w:sz w:val="16"/>
-              </w:rPr>
-              <w:t>University Roll Number</w:t>
-            </w:r>
-          </w:p>
-        </w:tc>
-        <w:tc>
-          <w:tcPr>
-            <w:tcW w:w="5040" w:type="dxa"/>
-            <w:shd w:val="clear" w:color="auto" w:fill="FFFFFF"/>
-            <w:tcMar>
-              <w:top w:w="45" w:type="dxa"/>
-              <w:left w:w="80" w:type="dxa"/>
-              <w:bottom w:w="45" w:type="dxa"/>
-              <w:right w:w="80" w:type="dxa"/>
-            </w:tcMar>
-          </w:tcPr>
-          <w:p>
-            <w:r>
-              <w:rPr>
-                <w:sz w:val="16"/>
-              </w:rPr>
-              <w:t>2400320100061</w:t>
-            </w:r>
-          </w:p>
-        </w:tc>
-      </w:tr>
-      <w:tr>
-        <w:tblPrEx>
-          <w:tblCellMar>
-            <w:top w:w="0" w:type="dxa"/>
-            <w:left w:w="108" w:type="dxa"/>
-            <w:bottom w:w="0" w:type="dxa"/>
-            <w:right w:w="108" w:type="dxa"/>
-          </w:tblCellMar>
-        </w:tblPrEx>
-        <w:trPr>
-          <w:jc w:val="center"/>
-        </w:trPr>
-        <w:tc>
-          <w:tcPr>
-            <w:tcW w:w="5040" w:type="dxa"/>
-            <w:shd w:val="clear" w:color="auto" w:fill="F8FAFC"/>
-            <w:tcMar>
-              <w:top w:w="45" w:type="dxa"/>
-              <w:left w:w="80" w:type="dxa"/>
-              <w:bottom w:w="45" w:type="dxa"/>
-              <w:right w:w="80" w:type="dxa"/>
-            </w:tcMar>
-          </w:tcPr>
-          <w:p>
-            <w:r>
-              <w:rPr>
-                <w:b/>
-                <w:color w:val="311465"/>
-                <w:sz w:val="16"/>
-              </w:rPr>
-              <w:t>Academic Institution</w:t>
-            </w:r>
-          </w:p>
-        </w:tc>
-        <w:tc>
-          <w:tcPr>
-            <w:tcW w:w="5040" w:type="dxa"/>
-            <w:shd w:val="clear" w:color="auto" w:fill="F8FAFC"/>
-            <w:tcMar>
-              <w:top w:w="45" w:type="dxa"/>
-              <w:left w:w="80" w:type="dxa"/>
-              <w:bottom w:w="45" w:type="dxa"/>
-              <w:right w:w="80" w:type="dxa"/>
-            </w:tcMar>
-          </w:tcPr>
-          <w:p>
-            <w:r>
-              <w:rPr>
-                <w:sz w:val="16"/>
-              </w:rPr>
-              <w:t>ABES Engineering College, Ghaziabad (Dept. of CSE)</w:t>
-            </w:r>
-          </w:p>
-        </w:tc>
-      </w:tr>
-      <w:tr>
-        <w:tblPrEx>
-          <w:tblCellMar>
-            <w:top w:w="0" w:type="dxa"/>
-            <w:left w:w="108" w:type="dxa"/>
-            <w:bottom w:w="0" w:type="dxa"/>
-            <w:right w:w="108" w:type="dxa"/>
-          </w:tblCellMar>
-        </w:tblPrEx>
-        <w:trPr>
-          <w:jc w:val="center"/>
-        </w:trPr>
-        <w:tc>
-          <w:tcPr>
-            <w:tcW w:w="5040" w:type="dxa"/>
-            <w:shd w:val="clear" w:color="auto" w:fill="FFFFFF"/>
-            <w:tcMar>
-              <w:top w:w="45" w:type="dxa"/>
-              <w:left w:w="80" w:type="dxa"/>
-              <w:bottom w:w="45" w:type="dxa"/>
-              <w:right w:w="80" w:type="dxa"/>
-            </w:tcMar>
-          </w:tcPr>
-          <w:p>
-            <w:r>
-              <w:rPr>
-                <w:b/>
-                <w:color w:val="311465"/>
-                <w:sz w:val="16"/>
-              </w:rPr>
-              <w:t>Industry Project Mentor</w:t>
-            </w:r>
-          </w:p>
-        </w:tc>
-        <w:tc>
-          <w:tcPr>
-            <w:tcW w:w="5040" w:type="dxa"/>
-            <w:shd w:val="clear" w:color="auto" w:fill="FFFFFF"/>
-            <w:tcMar>
-              <w:top w:w="45" w:type="dxa"/>
-              <w:left w:w="80" w:type="dxa"/>
-              <w:bottom w:w="45" w:type="dxa"/>
-              <w:right w:w="80" w:type="dxa"/>
-            </w:tcMar>
-          </w:tcPr>
-          <w:p>
-            <w:r>
-              <w:rPr>
-                <w:sz w:val="16"/>
-              </w:rPr>
-              <w:t>Radhika Singhal (HCLTech Career Shaper Mentor)</w:t>
-            </w:r>
-          </w:p>
-        </w:tc>
-      </w:tr>
-      <w:tr>
-        <w:tblPrEx>
-          <w:tblCellMar>
-            <w:top w:w="0" w:type="dxa"/>
-            <w:left w:w="108" w:type="dxa"/>
-            <w:bottom w:w="0" w:type="dxa"/>
-            <w:right w:w="108" w:type="dxa"/>
-          </w:tblCellMar>
-        </w:tblPrEx>
-        <w:trPr>
-          <w:jc w:val="center"/>
-        </w:trPr>
-        <w:tc>
-          <w:tcPr>
-            <w:tcW w:w="5040" w:type="dxa"/>
-            <w:shd w:val="clear" w:color="auto" w:fill="F8FAFC"/>
-            <w:tcMar>
-              <w:top w:w="45" w:type="dxa"/>
-              <w:left w:w="80" w:type="dxa"/>
-              <w:bottom w:w="45" w:type="dxa"/>
-              <w:right w:w="80" w:type="dxa"/>
-            </w:tcMar>
-          </w:tcPr>
-          <w:p>
-            <w:r>
-              <w:rPr>
-                <w:b/>
-                <w:color w:val="311465"/>
-                <w:sz w:val="16"/>
-              </w:rPr>
-              <w:t>Core Technology Stack</w:t>
-            </w:r>
-          </w:p>
-        </w:tc>
-        <w:tc>
-          <w:tcPr>
-            <w:tcW w:w="5040" w:type="dxa"/>
-            <w:shd w:val="clear" w:color="auto" w:fill="F8FAFC"/>
-            <w:tcMar>
-              <w:top w:w="45" w:type="dxa"/>
-              <w:left w:w="80" w:type="dxa"/>
-              <w:bottom w:w="45" w:type="dxa"/>
-              <w:right w:w="80" w:type="dxa"/>
-            </w:tcMar>
-          </w:tcPr>
-          <w:p>
-            <w:r>
-              <w:rPr>
-                <w:sz w:val="16"/>
-              </w:rPr>
-              <w:t>Python 3.11+, LangChain, LangGraph, Gemini 2.5 Flash, Trafilatura, Pydantic v2, Streamlit, Plotly</w:t>
-            </w:r>
-          </w:p>
-        </w:tc>
-      </w:tr>
-      <w:tr>
-        <w:tblPrEx>
-          <w:tblCellMar>
-            <w:top w:w="0" w:type="dxa"/>
-            <w:left w:w="108" w:type="dxa"/>
-            <w:bottom w:w="0" w:type="dxa"/>
-            <w:right w:w="108" w:type="dxa"/>
-          </w:tblCellMar>
-        </w:tblPrEx>
-        <w:trPr>
-          <w:jc w:val="center"/>
-        </w:trPr>
-        <w:tc>
-          <w:tcPr>
-            <w:tcW w:w="5040" w:type="dxa"/>
-            <w:shd w:val="clear" w:color="auto" w:fill="FFFFFF"/>
-            <w:tcMar>
-              <w:top w:w="45" w:type="dxa"/>
-              <w:left w:w="80" w:type="dxa"/>
-              <w:bottom w:w="45" w:type="dxa"/>
-              <w:right w:w="80" w:type="dxa"/>
-            </w:tcMar>
-          </w:tcPr>
-          <w:p>
-            <w:r>
-              <w:rPr>
-                <w:b/>
-                <w:color w:val="311465"/>
-                <w:sz w:val="16"/>
-              </w:rPr>
-              <w:t>Difficulty / Duration</w:t>
-            </w:r>
-          </w:p>
-        </w:tc>
-        <w:tc>
-          <w:tcPr>
-            <w:tcW w:w="5040" w:type="dxa"/>
-            <w:shd w:val="clear" w:color="auto" w:fill="FFFFFF"/>
-            <w:tcMar>
-              <w:top w:w="45" w:type="dxa"/>
-              <w:left w:w="80" w:type="dxa"/>
-              <w:bottom w:w="45" w:type="dxa"/>
-              <w:right w:w="80" w:type="dxa"/>
-            </w:tcMar>
-          </w:tcPr>
-          <w:p>
-            <w:r>
-              <w:rPr>
-                <w:sz w:val="16"/>
-              </w:rPr>
-              <w:t>Intermediate to Advanced Capstone | 4 Weeks (Sprint-based)</w:t>
-            </w:r>
-          </w:p>
-        </w:tc>
-      </w:tr>
-      <w:tr>
-        <w:tblPrEx>
-          <w:tblCellMar>
-            <w:top w:w="0" w:type="dxa"/>
-            <w:left w:w="108" w:type="dxa"/>
-            <w:bottom w:w="0" w:type="dxa"/>
-            <w:right w:w="108" w:type="dxa"/>
-          </w:tblCellMar>
-        </w:tblPrEx>
-        <w:trPr>
-          <w:jc w:val="center"/>
-        </w:trPr>
-        <w:tc>
-          <w:tcPr>
-            <w:tcW w:w="5040" w:type="dxa"/>
-            <w:shd w:val="clear" w:color="auto" w:fill="F8FAFC"/>
-            <w:tcMar>
-              <w:top w:w="45" w:type="dxa"/>
-              <w:left w:w="80" w:type="dxa"/>
-              <w:bottom w:w="45" w:type="dxa"/>
-              <w:right w:w="80" w:type="dxa"/>
-            </w:tcMar>
-          </w:tcPr>
-          <w:p>
-            <w:r>
-              <w:rPr>
-                <w:b/>
-                <w:color w:val="311465"/>
-                <w:sz w:val="16"/>
-              </w:rPr>
-              <w:t>GitHub Repository</w:t>
-            </w:r>
-          </w:p>
-        </w:tc>
-        <w:tc>
-          <w:tcPr>
-            <w:tcW w:w="5040" w:type="dxa"/>
-            <w:shd w:val="clear" w:color="auto" w:fill="F8FAFC"/>
-            <w:tcMar>
-              <w:top w:w="45" w:type="dxa"/>
-              <w:left w:w="80" w:type="dxa"/>
-              <w:bottom w:w="45" w:type="dxa"/>
-              <w:right w:w="80" w:type="dxa"/>
-            </w:tcMar>
-          </w:tcPr>
-          <w:p>
-            <w:r>
-              <w:rPr>
-                <w:sz w:val="16"/>
-              </w:rPr>
-              <w:t>https://github.com/adarsh-dubey-gthb/hcl-marketanalyzer.git</w:t>
-            </w:r>
-          </w:p>
-        </w:tc>
-      </w:tr>
-      <w:tr>
-        <w:tblPrEx>
-          <w:tblCellMar>
-            <w:top w:w="0" w:type="dxa"/>
-            <w:left w:w="108" w:type="dxa"/>
-            <w:bottom w:w="0" w:type="dxa"/>
-            <w:right w:w="108" w:type="dxa"/>
-          </w:tblCellMar>
-        </w:tblPrEx>
-        <w:trPr>
-          <w:jc w:val="center"/>
-        </w:trPr>
-        <w:tc>
-          <w:tcPr>
-            <w:tcW w:w="5040" w:type="dxa"/>
-            <w:shd w:val="clear" w:color="auto" w:fill="FFFFFF"/>
-            <w:tcMar>
-              <w:top w:w="45" w:type="dxa"/>
-              <w:left w:w="80" w:type="dxa"/>
-              <w:bottom w:w="45" w:type="dxa"/>
-              <w:right w:w="80" w:type="dxa"/>
-            </w:tcMar>
-          </w:tcPr>
-          <w:p>
-            <w:r>
-              <w:rPr>
-                <w:b/>
-                <w:color w:val="311465"/>
-                <w:sz w:val="16"/>
-              </w:rPr>
-              <w:t>Submission Format &amp; Scope</w:t>
-            </w:r>
-          </w:p>
-        </w:tc>
-        <w:tc>
-          <w:tcPr>
-            <w:tcW w:w="5040" w:type="dxa"/>
-            <w:shd w:val="clear" w:color="auto" w:fill="FFFFFF"/>
-            <w:tcMar>
-              <w:top w:w="45" w:type="dxa"/>
-              <w:left w:w="80" w:type="dxa"/>
-              <w:bottom w:w="45" w:type="dxa"/>
-              <w:right w:w="80" w:type="dxa"/>
-            </w:tcMar>
-          </w:tcPr>
-          <w:p>
-            <w:r>
-              <w:rPr>
-                <w:sz w:val="16"/>
-              </w:rPr>
-              <w:t>Individual Comprehensive Project Deliverable (1 Learner)</w:t>
-            </w:r>
-          </w:p>
-        </w:tc>
-      </w:tr>
-      <w:tr>
-        <w:tblPrEx>
-          <w:tblCellMar>
-            <w:top w:w="0" w:type="dxa"/>
-            <w:left w:w="108" w:type="dxa"/>
-            <w:bottom w:w="0" w:type="dxa"/>
-            <w:right w:w="108" w:type="dxa"/>
-          </w:tblCellMar>
-        </w:tblPrEx>
-        <w:trPr>
-          <w:jc w:val="center"/>
-        </w:trPr>
-        <w:tc>
-          <w:tcPr>
-            <w:tcW w:w="5040" w:type="dxa"/>
-            <w:shd w:val="clear" w:color="auto" w:fill="F8FAFC"/>
-            <w:tcMar>
-              <w:top w:w="45" w:type="dxa"/>
-              <w:left w:w="80" w:type="dxa"/>
-              <w:bottom w:w="45" w:type="dxa"/>
-              <w:right w:w="80" w:type="dxa"/>
-            </w:tcMar>
-          </w:tcPr>
-          <w:p>
-            <w:r>
-              <w:rPr>
-                <w:b/>
-                <w:color w:val="311465"/>
-                <w:sz w:val="16"/>
-              </w:rPr>
-              <w:t>Academic Session</w:t>
-            </w:r>
-          </w:p>
-        </w:tc>
-        <w:tc>
-          <w:tcPr>
-            <w:tcW w:w="5040" w:type="dxa"/>
-            <w:shd w:val="clear" w:color="auto" w:fill="F8FAFC"/>
-            <w:tcMar>
-              <w:top w:w="45" w:type="dxa"/>
-              <w:left w:w="80" w:type="dxa"/>
-              <w:bottom w:w="45" w:type="dxa"/>
-              <w:right w:w="80" w:type="dxa"/>
-            </w:tcMar>
-          </w:tcPr>
-          <w:p>
-            <w:r>
-              <w:rPr>
-                <w:sz w:val="16"/>
-              </w:rPr>
               <w:t>202</w:t>
             </w:r>
             <w:r>
@@ -797,8 +835,6 @@
               </w:rPr>
               <w:t>7</w:t>
             </w:r>
-            <w:bookmarkStart w:id="0" w:name="_GoBack"/>
-            <w:bookmarkEnd w:id="0"/>
             <w:r>
               <w:rPr>
                 <w:sz w:val="16"/>
@@ -1487,14 +1523,6 @@
         <w:gridCol w:w="5760"/>
       </w:tblGrid>
       <w:tr>
-        <w:tblPrEx>
-          <w:tblCellMar>
-            <w:top w:w="0" w:type="dxa"/>
-            <w:left w:w="108" w:type="dxa"/>
-            <w:bottom w:w="0" w:type="dxa"/>
-            <w:right w:w="108" w:type="dxa"/>
-          </w:tblCellMar>
-        </w:tblPrEx>
         <w:trPr>
           <w:jc w:val="center"/>
         </w:trPr>
@@ -1566,14 +1594,6 @@
         </w:tc>
       </w:tr>
       <w:tr>
-        <w:tblPrEx>
-          <w:tblCellMar>
-            <w:top w:w="0" w:type="dxa"/>
-            <w:left w:w="108" w:type="dxa"/>
-            <w:bottom w:w="0" w:type="dxa"/>
-            <w:right w:w="108" w:type="dxa"/>
-          </w:tblCellMar>
-        </w:tblPrEx>
         <w:trPr>
           <w:jc w:val="center"/>
         </w:trPr>
@@ -4260,7 +4280,7 @@
     <w:lvl w:ilvl="0" w:tentative="0">
       <w:start w:val="1"/>
       <w:numFmt w:val="decimal"/>
-      <w:pStyle w:val="31"/>
+      <w:pStyle w:val="32"/>
       <w:lvlText w:val="%1."/>
       <w:lvlJc w:val="left"/>
       <w:pPr>
@@ -4278,7 +4298,7 @@
     <w:lvl w:ilvl="0" w:tentative="0">
       <w:start w:val="1"/>
       <w:numFmt w:val="decimal"/>
-      <w:pStyle w:val="30"/>
+      <w:pStyle w:val="31"/>
       <w:lvlText w:val="%1."/>
       <w:lvlJc w:val="left"/>
       <w:pPr>
@@ -4296,7 +4316,7 @@
     <w:lvl w:ilvl="0" w:tentative="0">
       <w:start w:val="1"/>
       <w:numFmt w:val="bullet"/>
-      <w:pStyle w:val="25"/>
+      <w:pStyle w:val="26"/>
       <w:lvlText w:val=""/>
       <w:lvlJc w:val="left"/>
       <w:pPr>
@@ -4317,7 +4337,7 @@
     <w:lvl w:ilvl="0" w:tentative="0">
       <w:start w:val="1"/>
       <w:numFmt w:val="bullet"/>
-      <w:pStyle w:val="24"/>
+      <w:pStyle w:val="25"/>
       <w:lvlText w:val=""/>
       <w:lvlJc w:val="left"/>
       <w:pPr>
@@ -4338,7 +4358,7 @@
     <w:lvl w:ilvl="0" w:tentative="0">
       <w:start w:val="1"/>
       <w:numFmt w:val="decimal"/>
-      <w:pStyle w:val="29"/>
+      <w:pStyle w:val="30"/>
       <w:lvlText w:val="%1."/>
       <w:lvlJc w:val="left"/>
       <w:pPr>
@@ -4356,7 +4376,7 @@
     <w:lvl w:ilvl="0" w:tentative="0">
       <w:start w:val="1"/>
       <w:numFmt w:val="bullet"/>
-      <w:pStyle w:val="23"/>
+      <w:pStyle w:val="24"/>
       <w:lvlText w:val=""/>
       <w:lvlJc w:val="left"/>
       <w:pPr>
@@ -4396,7 +4416,7 @@
   <w:docDefaults>
     <w:rPrDefault>
       <w:rPr>
-        <w:rFonts w:asciiTheme="minorHAnsi" w:hAnsiTheme="minorHAnsi" w:eastAsiaTheme="minorEastAsia" w:cstheme="minorBidi"/>
+        <w:rFonts w:ascii="Times New Roman" w:hAnsi="Times New Roman" w:eastAsia="SimSun" w:cs="Times New Roman"/>
       </w:rPr>
     </w:rPrDefault>
     <w:pPrDefault/>
@@ -4434,7 +4454,7 @@
     <w:lsdException w:uiPriority="99" w:name="footnote text"/>
     <w:lsdException w:uiPriority="99" w:name="annotation text"/>
     <w:lsdException w:qFormat="1" w:uiPriority="99" w:semiHidden="0" w:name="header"/>
-    <w:lsdException w:uiPriority="99" w:semiHidden="0" w:name="footer"/>
+    <w:lsdException w:qFormat="1" w:uiPriority="99" w:semiHidden="0" w:name="footer"/>
     <w:lsdException w:uiPriority="99" w:name="index heading"/>
     <w:lsdException w:qFormat="1" w:uiPriority="35" w:name="caption"/>
     <w:lsdException w:uiPriority="99" w:name="table of figures"/>
@@ -4447,21 +4467,21 @@
     <w:lsdException w:uiPriority="99" w:name="endnote reference"/>
     <w:lsdException w:uiPriority="99" w:name="endnote text"/>
     <w:lsdException w:uiPriority="99" w:name="table of authorities"/>
-    <w:lsdException w:uiPriority="99" w:semiHidden="0" w:name="macro"/>
+    <w:lsdException w:qFormat="1" w:uiPriority="99" w:semiHidden="0" w:name="macro"/>
     <w:lsdException w:uiPriority="99" w:name="toa heading"/>
-    <w:lsdException w:uiPriority="99" w:semiHidden="0" w:name="List"/>
-    <w:lsdException w:uiPriority="99" w:semiHidden="0" w:name="List Bullet"/>
-    <w:lsdException w:uiPriority="99" w:semiHidden="0" w:name="List Number"/>
-    <w:lsdException w:uiPriority="99" w:semiHidden="0" w:name="List 2"/>
-    <w:lsdException w:uiPriority="99" w:semiHidden="0" w:name="List 3"/>
+    <w:lsdException w:qFormat="1" w:uiPriority="99" w:semiHidden="0" w:name="List"/>
+    <w:lsdException w:qFormat="1" w:uiPriority="99" w:semiHidden="0" w:name="List Bullet"/>
+    <w:lsdException w:qFormat="1" w:uiPriority="99" w:semiHidden="0" w:name="List Number"/>
+    <w:lsdException w:qFormat="1" w:uiPriority="99" w:semiHidden="0" w:name="List 2"/>
+    <w:lsdException w:qFormat="1" w:uiPriority="99" w:semiHidden="0" w:name="List 3"/>
     <w:lsdException w:uiPriority="99" w:name="List 4"/>
     <w:lsdException w:uiPriority="99" w:name="List 5"/>
-    <w:lsdException w:uiPriority="99" w:semiHidden="0" w:name="List Bullet 2"/>
-    <w:lsdException w:uiPriority="99" w:semiHidden="0" w:name="List Bullet 3"/>
+    <w:lsdException w:qFormat="1" w:uiPriority="99" w:semiHidden="0" w:name="List Bullet 2"/>
+    <w:lsdException w:qFormat="1" w:uiPriority="99" w:semiHidden="0" w:name="List Bullet 3"/>
     <w:lsdException w:uiPriority="99" w:name="List Bullet 4"/>
     <w:lsdException w:uiPriority="99" w:name="List Bullet 5"/>
-    <w:lsdException w:uiPriority="99" w:semiHidden="0" w:name="List Number 2"/>
-    <w:lsdException w:uiPriority="99" w:semiHidden="0" w:name="List Number 3"/>
+    <w:lsdException w:qFormat="1" w:uiPriority="99" w:semiHidden="0" w:name="List Number 2"/>
+    <w:lsdException w:qFormat="1" w:uiPriority="99" w:semiHidden="0" w:name="List Number 3"/>
     <w:lsdException w:uiPriority="99" w:name="List Number 4"/>
     <w:lsdException w:uiPriority="99" w:name="List Number 5"/>
     <w:lsdException w:qFormat="1" w:unhideWhenUsed="0" w:uiPriority="10" w:semiHidden="0" w:name="Title"/>
@@ -4470,9 +4490,9 @@
     <w:lsdException w:qFormat="1" w:uiPriority="1" w:name="Default Paragraph Font"/>
     <w:lsdException w:qFormat="1" w:uiPriority="99" w:semiHidden="0" w:name="Body Text"/>
     <w:lsdException w:uiPriority="99" w:name="Body Text Indent"/>
-    <w:lsdException w:uiPriority="99" w:semiHidden="0" w:name="List Continue"/>
-    <w:lsdException w:uiPriority="99" w:semiHidden="0" w:name="List Continue 2"/>
-    <w:lsdException w:uiPriority="99" w:semiHidden="0" w:name="List Continue 3"/>
+    <w:lsdException w:qFormat="1" w:uiPriority="99" w:semiHidden="0" w:name="List Continue"/>
+    <w:lsdException w:qFormat="1" w:uiPriority="99" w:semiHidden="0" w:name="List Continue 2"/>
+    <w:lsdException w:qFormat="1" w:uiPriority="99" w:semiHidden="0" w:name="List Continue 3"/>
     <w:lsdException w:uiPriority="99" w:name="List Continue 4"/>
     <w:lsdException w:uiPriority="99" w:name="List Continue 5"/>
     <w:lsdException w:uiPriority="99" w:name="Message Header"/>
@@ -4483,7 +4503,7 @@
     <w:lsdException w:uiPriority="99" w:name="Body Text First Indent 2"/>
     <w:lsdException w:uiPriority="99" w:name="Note Heading"/>
     <w:lsdException w:uiPriority="99" w:semiHidden="0" w:name="Body Text 2"/>
-    <w:lsdException w:uiPriority="99" w:semiHidden="0" w:name="Body Text 3"/>
+    <w:lsdException w:qFormat="1" w:uiPriority="99" w:semiHidden="0" w:name="Body Text 3"/>
     <w:lsdException w:uiPriority="99" w:name="Body Text Indent 2"/>
     <w:lsdException w:uiPriority="99" w:name="Body Text Indent 3"/>
     <w:lsdException w:uiPriority="99" w:name="Block Text"/>
@@ -4673,7 +4693,7 @@
     <w:name w:val="heading 1"/>
     <w:basedOn w:val="1"/>
     <w:next w:val="1"/>
-    <w:link w:val="138"/>
+    <w:link w:val="139"/>
     <w:qFormat/>
     <w:uiPriority w:val="9"/>
     <w:pPr>
@@ -4695,7 +4715,7 @@
     <w:name w:val="heading 2"/>
     <w:basedOn w:val="1"/>
     <w:next w:val="1"/>
-    <w:link w:val="139"/>
+    <w:link w:val="140"/>
     <w:unhideWhenUsed/>
     <w:qFormat/>
     <w:uiPriority w:val="9"/>
@@ -4723,7 +4743,7 @@
     <w:name w:val="heading 3"/>
     <w:basedOn w:val="1"/>
     <w:next w:val="1"/>
-    <w:link w:val="140"/>
+    <w:link w:val="141"/>
     <w:unhideWhenUsed/>
     <w:qFormat/>
     <w:uiPriority w:val="9"/>
@@ -4749,7 +4769,7 @@
     <w:name w:val="heading 4"/>
     <w:basedOn w:val="1"/>
     <w:next w:val="1"/>
-    <w:link w:val="150"/>
+    <w:link w:val="151"/>
     <w:semiHidden/>
     <w:unhideWhenUsed/>
     <w:qFormat/>
@@ -4778,7 +4798,7 @@
     <w:name w:val="heading 5"/>
     <w:basedOn w:val="1"/>
     <w:next w:val="1"/>
-    <w:link w:val="151"/>
+    <w:link w:val="152"/>
     <w:semiHidden/>
     <w:unhideWhenUsed/>
     <w:qFormat/>
@@ -4798,7 +4818,7 @@
     <w:name w:val="heading 6"/>
     <w:basedOn w:val="1"/>
     <w:next w:val="1"/>
-    <w:link w:val="152"/>
+    <w:link w:val="153"/>
     <w:semiHidden/>
     <w:unhideWhenUsed/>
     <w:qFormat/>
@@ -4820,7 +4840,7 @@
     <w:name w:val="heading 7"/>
     <w:basedOn w:val="1"/>
     <w:next w:val="1"/>
-    <w:link w:val="153"/>
+    <w:link w:val="154"/>
     <w:semiHidden/>
     <w:unhideWhenUsed/>
     <w:qFormat/>
@@ -4850,7 +4870,7 @@
     <w:name w:val="heading 8"/>
     <w:basedOn w:val="1"/>
     <w:next w:val="1"/>
-    <w:link w:val="154"/>
+    <w:link w:val="155"/>
     <w:semiHidden/>
     <w:unhideWhenUsed/>
     <w:qFormat/>
@@ -4877,7 +4897,7 @@
     <w:name w:val="heading 9"/>
     <w:basedOn w:val="1"/>
     <w:next w:val="1"/>
-    <w:link w:val="155"/>
+    <w:link w:val="156"/>
     <w:semiHidden/>
     <w:unhideWhenUsed/>
     <w:qFormat/>
@@ -4930,7 +4950,7 @@
   <w:style w:type="paragraph" w:styleId="13">
     <w:name w:val="Body Text"/>
     <w:basedOn w:val="1"/>
-    <w:link w:val="144"/>
+    <w:link w:val="145"/>
     <w:unhideWhenUsed/>
     <w:qFormat/>
     <w:uiPriority w:val="99"/>
@@ -4941,7 +4961,7 @@
   <w:style w:type="paragraph" w:styleId="14">
     <w:name w:val="Body Text 2"/>
     <w:basedOn w:val="1"/>
-    <w:link w:val="145"/>
+    <w:link w:val="146"/>
     <w:unhideWhenUsed/>
     <w:uiPriority w:val="99"/>
     <w:pPr>
@@ -4951,8 +4971,9 @@
   <w:style w:type="paragraph" w:styleId="15">
     <w:name w:val="Body Text 3"/>
     <w:basedOn w:val="1"/>
-    <w:link w:val="146"/>
+    <w:link w:val="147"/>
     <w:unhideWhenUsed/>
+    <w:qFormat/>
     <w:uiPriority w:val="99"/>
     <w:pPr>
       <w:spacing w:after="120"/>
@@ -4999,8 +5020,9 @@
   <w:style w:type="paragraph" w:styleId="18">
     <w:name w:val="footer"/>
     <w:basedOn w:val="1"/>
-    <w:link w:val="136"/>
+    <w:link w:val="137"/>
     <w:unhideWhenUsed/>
+    <w:qFormat/>
     <w:uiPriority w:val="99"/>
     <w:pPr>
       <w:tabs>
@@ -5013,7 +5035,7 @@
   <w:style w:type="paragraph" w:styleId="19">
     <w:name w:val="header"/>
     <w:basedOn w:val="1"/>
-    <w:link w:val="135"/>
+    <w:link w:val="136"/>
     <w:unhideWhenUsed/>
     <w:qFormat/>
     <w:uiPriority w:val="99"/>
@@ -5025,40 +5047,55 @@
       <w:spacing w:after="0" w:line="240" w:lineRule="auto"/>
     </w:pPr>
   </w:style>
-  <w:style w:type="paragraph" w:styleId="20">
+  <w:style w:type="character" w:styleId="20">
+    <w:name w:val="Hyperlink"/>
+    <w:basedOn w:val="11"/>
+    <w:semiHidden/>
+    <w:unhideWhenUsed/>
+    <w:uiPriority w:val="99"/>
+    <w:rPr>
+      <w:color w:val="0000FF"/>
+      <w:u w:val="single"/>
+    </w:rPr>
+  </w:style>
+  <w:style w:type="paragraph" w:styleId="21">
     <w:name w:val="List"/>
     <w:basedOn w:val="1"/>
     <w:unhideWhenUsed/>
+    <w:qFormat/>
     <w:uiPriority w:val="99"/>
     <w:pPr>
       <w:ind w:left="360" w:hanging="360"/>
       <w:contextualSpacing/>
     </w:pPr>
   </w:style>
-  <w:style w:type="paragraph" w:styleId="21">
+  <w:style w:type="paragraph" w:styleId="22">
     <w:name w:val="List 2"/>
     <w:basedOn w:val="1"/>
     <w:unhideWhenUsed/>
+    <w:qFormat/>
     <w:uiPriority w:val="99"/>
     <w:pPr>
       <w:ind w:left="720" w:hanging="360"/>
       <w:contextualSpacing/>
     </w:pPr>
   </w:style>
-  <w:style w:type="paragraph" w:styleId="22">
+  <w:style w:type="paragraph" w:styleId="23">
     <w:name w:val="List 3"/>
     <w:basedOn w:val="1"/>
     <w:unhideWhenUsed/>
+    <w:qFormat/>
     <w:uiPriority w:val="99"/>
     <w:pPr>
       <w:ind w:left="1080" w:hanging="360"/>
       <w:contextualSpacing/>
     </w:pPr>
   </w:style>
-  <w:style w:type="paragraph" w:styleId="23">
+  <w:style w:type="paragraph" w:styleId="24">
     <w:name w:val="List Bullet"/>
     <w:basedOn w:val="1"/>
     <w:unhideWhenUsed/>
+    <w:qFormat/>
     <w:uiPriority w:val="99"/>
     <w:pPr>
       <w:numPr>
@@ -5068,10 +5105,11 @@
       <w:contextualSpacing/>
     </w:pPr>
   </w:style>
-  <w:style w:type="paragraph" w:styleId="24">
+  <w:style w:type="paragraph" w:styleId="25">
     <w:name w:val="List Bullet 2"/>
     <w:basedOn w:val="1"/>
     <w:unhideWhenUsed/>
+    <w:qFormat/>
     <w:uiPriority w:val="99"/>
     <w:pPr>
       <w:numPr>
@@ -5081,10 +5119,11 @@
       <w:contextualSpacing/>
     </w:pPr>
   </w:style>
-  <w:style w:type="paragraph" w:styleId="25">
+  <w:style w:type="paragraph" w:styleId="26">
     <w:name w:val="List Bullet 3"/>
     <w:basedOn w:val="1"/>
     <w:unhideWhenUsed/>
+    <w:qFormat/>
     <w:uiPriority w:val="99"/>
     <w:pPr>
       <w:numPr>
@@ -5094,10 +5133,11 @@
       <w:contextualSpacing/>
     </w:pPr>
   </w:style>
-  <w:style w:type="paragraph" w:styleId="26">
+  <w:style w:type="paragraph" w:styleId="27">
     <w:name w:val="List Continue"/>
     <w:basedOn w:val="1"/>
     <w:unhideWhenUsed/>
+    <w:qFormat/>
     <w:uiPriority w:val="99"/>
     <w:pPr>
       <w:spacing w:after="120"/>
@@ -5105,10 +5145,11 @@
       <w:contextualSpacing/>
     </w:pPr>
   </w:style>
-  <w:style w:type="paragraph" w:styleId="27">
+  <w:style w:type="paragraph" w:styleId="28">
     <w:name w:val="List Continue 2"/>
     <w:basedOn w:val="1"/>
     <w:unhideWhenUsed/>
+    <w:qFormat/>
     <w:uiPriority w:val="99"/>
     <w:pPr>
       <w:spacing w:after="120"/>
@@ -5116,10 +5157,11 @@
       <w:contextualSpacing/>
     </w:pPr>
   </w:style>
-  <w:style w:type="paragraph" w:styleId="28">
+  <w:style w:type="paragraph" w:styleId="29">
     <w:name w:val="List Continue 3"/>
     <w:basedOn w:val="1"/>
     <w:unhideWhenUsed/>
+    <w:qFormat/>
     <w:uiPriority w:val="99"/>
     <w:pPr>
       <w:spacing w:after="120"/>
@@ -5127,10 +5169,11 @@
       <w:contextualSpacing/>
     </w:pPr>
   </w:style>
-  <w:style w:type="paragraph" w:styleId="29">
+  <w:style w:type="paragraph" w:styleId="30">
     <w:name w:val="List Number"/>
     <w:basedOn w:val="1"/>
     <w:unhideWhenUsed/>
+    <w:qFormat/>
     <w:uiPriority w:val="99"/>
     <w:pPr>
       <w:numPr>
@@ -5140,10 +5183,11 @@
       <w:contextualSpacing/>
     </w:pPr>
   </w:style>
-  <w:style w:type="paragraph" w:styleId="30">
+  <w:style w:type="paragraph" w:styleId="31">
     <w:name w:val="List Number 2"/>
     <w:basedOn w:val="1"/>
     <w:unhideWhenUsed/>
+    <w:qFormat/>
     <w:uiPriority w:val="99"/>
     <w:pPr>
       <w:numPr>
@@ -5153,10 +5197,11 @@
       <w:contextualSpacing/>
     </w:pPr>
   </w:style>
-  <w:style w:type="paragraph" w:styleId="31">
+  <w:style w:type="paragraph" w:styleId="32">
     <w:name w:val="List Number 3"/>
     <w:basedOn w:val="1"/>
     <w:unhideWhenUsed/>
+    <w:qFormat/>
     <w:uiPriority w:val="99"/>
     <w:pPr>
       <w:numPr>
@@ -5166,10 +5211,11 @@
       <w:contextualSpacing/>
     </w:pPr>
   </w:style>
-  <w:style w:type="paragraph" w:styleId="32">
+  <w:style w:type="paragraph" w:styleId="33">
     <w:name w:val="macro"/>
-    <w:link w:val="147"/>
+    <w:link w:val="148"/>
     <w:unhideWhenUsed/>
+    <w:qFormat/>
     <w:uiPriority w:val="99"/>
     <w:pPr>
       <w:tabs>
@@ -5190,7 +5236,7 @@
       <w:lang w:val="en-US" w:eastAsia="en-US" w:bidi="ar-SA"/>
     </w:rPr>
   </w:style>
-  <w:style w:type="character" w:styleId="33">
+  <w:style w:type="character" w:styleId="34">
     <w:name w:val="Strong"/>
     <w:basedOn w:val="11"/>
     <w:qFormat/>
@@ -5200,11 +5246,11 @@
       <w:bCs/>
     </w:rPr>
   </w:style>
-  <w:style w:type="paragraph" w:styleId="34">
+  <w:style w:type="paragraph" w:styleId="35">
     <w:name w:val="Subtitle"/>
     <w:basedOn w:val="1"/>
     <w:next w:val="1"/>
-    <w:link w:val="142"/>
+    <w:link w:val="143"/>
     <w:qFormat/>
     <w:uiPriority w:val="11"/>
     <w:rPr>
@@ -5222,7 +5268,7 @@
       </w14:textFill>
     </w:rPr>
   </w:style>
-  <w:style w:type="table" w:styleId="35">
+  <w:style w:type="table" w:styleId="36">
     <w:name w:val="Table Grid"/>
     <w:basedOn w:val="12"/>
     <w:uiPriority w:val="59"/>
@@ -5246,11 +5292,11 @@
       </w:tblCellMar>
     </w:tblPr>
   </w:style>
-  <w:style w:type="paragraph" w:styleId="36">
+  <w:style w:type="paragraph" w:styleId="37">
     <w:name w:val="Title"/>
     <w:basedOn w:val="1"/>
     <w:next w:val="1"/>
-    <w:link w:val="141"/>
+    <w:link w:val="142"/>
     <w:qFormat/>
     <w:uiPriority w:val="10"/>
     <w:pPr>
@@ -5269,7 +5315,7 @@
       <w:szCs w:val="52"/>
     </w:rPr>
   </w:style>
-  <w:style w:type="table" w:styleId="37">
+  <w:style w:type="table" w:styleId="38">
     <w:name w:val="Light Shading"/>
     <w:basedOn w:val="12"/>
     <w:uiPriority w:val="60"/>
@@ -5368,7 +5414,7 @@
       </w:tcPr>
     </w:tblStylePr>
   </w:style>
-  <w:style w:type="table" w:styleId="38">
+  <w:style w:type="table" w:styleId="39">
     <w:name w:val="Light Shading Accent 1"/>
     <w:basedOn w:val="12"/>
     <w:uiPriority w:val="60"/>
@@ -5467,7 +5513,7 @@
       </w:tcPr>
     </w:tblStylePr>
   </w:style>
-  <w:style w:type="table" w:styleId="39">
+  <w:style w:type="table" w:styleId="40">
     <w:name w:val="Light Shading Accent 2"/>
     <w:basedOn w:val="12"/>
     <w:uiPriority w:val="60"/>
@@ -5566,7 +5612,7 @@
       </w:tcPr>
     </w:tblStylePr>
   </w:style>
-  <w:style w:type="table" w:styleId="40">
+  <w:style w:type="table" w:styleId="41">
     <w:name w:val="Light Shading Accent 3"/>
     <w:basedOn w:val="12"/>
     <w:uiPriority w:val="60"/>
@@ -5665,7 +5711,7 @@
       </w:tcPr>
     </w:tblStylePr>
   </w:style>
-  <w:style w:type="table" w:styleId="41">
+  <w:style w:type="table" w:styleId="42">
     <w:name w:val="Light Shading Accent 4"/>
     <w:basedOn w:val="12"/>
     <w:uiPriority w:val="60"/>
@@ -5764,7 +5810,7 @@
       </w:tcPr>
     </w:tblStylePr>
   </w:style>
-  <w:style w:type="table" w:styleId="42">
+  <w:style w:type="table" w:styleId="43">
     <w:name w:val="Light Shading Accent 5"/>
     <w:basedOn w:val="12"/>
     <w:uiPriority w:val="60"/>
@@ -5863,7 +5909,7 @@
       </w:tcPr>
     </w:tblStylePr>
   </w:style>
-  <w:style w:type="table" w:styleId="43">
+  <w:style w:type="table" w:styleId="44">
     <w:name w:val="Light Shading Accent 6"/>
     <w:basedOn w:val="12"/>
     <w:uiPriority w:val="60"/>
@@ -5962,7 +6008,7 @@
       </w:tcPr>
     </w:tblStylePr>
   </w:style>
-  <w:style w:type="table" w:styleId="44">
+  <w:style w:type="table" w:styleId="45">
     <w:name w:val="Light List"/>
     <w:basedOn w:val="12"/>
     <w:uiPriority w:val="61"/>
@@ -6055,7 +6101,7 @@
       </w:tcPr>
     </w:tblStylePr>
   </w:style>
-  <w:style w:type="table" w:styleId="45">
+  <w:style w:type="table" w:styleId="46">
     <w:name w:val="Light List Accent 1"/>
     <w:basedOn w:val="12"/>
     <w:uiPriority w:val="61"/>
@@ -6148,7 +6194,7 @@
       </w:tcPr>
     </w:tblStylePr>
   </w:style>
-  <w:style w:type="table" w:styleId="46">
+  <w:style w:type="table" w:styleId="47">
     <w:name w:val="Light List Accent 2"/>
     <w:basedOn w:val="12"/>
     <w:uiPriority w:val="61"/>
@@ -6241,7 +6287,7 @@
       </w:tcPr>
     </w:tblStylePr>
   </w:style>
-  <w:style w:type="table" w:styleId="47">
+  <w:style w:type="table" w:styleId="48">
     <w:name w:val="Light List Accent 3"/>
     <w:basedOn w:val="12"/>
     <w:uiPriority w:val="61"/>
@@ -6334,7 +6380,7 @@
       </w:tcPr>
     </w:tblStylePr>
   </w:style>
-  <w:style w:type="table" w:styleId="48">
+  <w:style w:type="table" w:styleId="49">
     <w:name w:val="Light List Accent 4"/>
     <w:basedOn w:val="12"/>
     <w:uiPriority w:val="61"/>
@@ -6427,7 +6473,7 @@
       </w:tcPr>
     </w:tblStylePr>
   </w:style>
-  <w:style w:type="table" w:styleId="49">
+  <w:style w:type="table" w:styleId="50">
     <w:name w:val="Light List Accent 5"/>
     <w:basedOn w:val="12"/>
     <w:uiPriority w:val="61"/>
@@ -6520,7 +6566,7 @@
       </w:tcPr>
     </w:tblStylePr>
   </w:style>
-  <w:style w:type="table" w:styleId="50">
+  <w:style w:type="table" w:styleId="51">
     <w:name w:val="Light List Accent 6"/>
     <w:basedOn w:val="12"/>
     <w:uiPriority w:val="61"/>
@@ -6613,7 +6659,7 @@
       </w:tcPr>
     </w:tblStylePr>
   </w:style>
-  <w:style w:type="table" w:styleId="51">
+  <w:style w:type="table" w:styleId="52">
     <w:name w:val="Light Grid"/>
     <w:basedOn w:val="12"/>
     <w:uiPriority w:val="62"/>
@@ -6739,7 +6785,7 @@
       </w:tcPr>
     </w:tblStylePr>
   </w:style>
-  <w:style w:type="table" w:styleId="52">
+  <w:style w:type="table" w:styleId="53">
     <w:name w:val="Light Grid Accent 1"/>
     <w:basedOn w:val="12"/>
     <w:uiPriority w:val="62"/>
@@ -6865,7 +6911,7 @@
       </w:tcPr>
     </w:tblStylePr>
   </w:style>
-  <w:style w:type="table" w:styleId="53">
+  <w:style w:type="table" w:styleId="54">
     <w:name w:val="Light Grid Accent 2"/>
     <w:basedOn w:val="12"/>
     <w:uiPriority w:val="62"/>
@@ -6991,7 +7037,7 @@
       </w:tcPr>
     </w:tblStylePr>
   </w:style>
-  <w:style w:type="table" w:styleId="54">
+  <w:style w:type="table" w:styleId="55">
     <w:name w:val="Light Grid Accent 3"/>
     <w:basedOn w:val="12"/>
     <w:uiPriority w:val="62"/>
@@ -7117,7 +7163,7 @@
       </w:tcPr>
     </w:tblStylePr>
   </w:style>
-  <w:style w:type="table" w:styleId="55">
+  <w:style w:type="table" w:styleId="56">
     <w:name w:val="Light Grid Accent 4"/>
     <w:basedOn w:val="12"/>
     <w:uiPriority w:val="62"/>
@@ -7243,7 +7289,7 @@
       </w:tcPr>
     </w:tblStylePr>
   </w:style>
-  <w:style w:type="table" w:styleId="56">
+  <w:style w:type="table" w:styleId="57">
     <w:name w:val="Light Grid Accent 5"/>
     <w:basedOn w:val="12"/>
     <w:uiPriority w:val="62"/>
@@ -7369,7 +7415,7 @@
       </w:tcPr>
     </w:tblStylePr>
   </w:style>
-  <w:style w:type="table" w:styleId="57">
+  <w:style w:type="table" w:styleId="58">
     <w:name w:val="Light Grid Accent 6"/>
     <w:basedOn w:val="12"/>
     <w:uiPriority w:val="62"/>
@@ -7495,7 +7541,7 @@
       </w:tcPr>
     </w:tblStylePr>
   </w:style>
-  <w:style w:type="table" w:styleId="58">
+  <w:style w:type="table" w:styleId="59">
     <w:name w:val="Medium Shading 1"/>
     <w:basedOn w:val="12"/>
     <w:uiPriority w:val="63"/>
@@ -7602,7 +7648,7 @@
       </w:tcPr>
     </w:tblStylePr>
   </w:style>
-  <w:style w:type="table" w:styleId="59">
+  <w:style w:type="table" w:styleId="60">
     <w:name w:val="Medium Shading 1 Accent 1"/>
     <w:basedOn w:val="12"/>
     <w:uiPriority w:val="63"/>
@@ -7709,7 +7755,7 @@
       </w:tcPr>
     </w:tblStylePr>
   </w:style>
-  <w:style w:type="table" w:styleId="60">
+  <w:style w:type="table" w:styleId="61">
     <w:name w:val="Medium Shading 1 Accent 2"/>
     <w:basedOn w:val="12"/>
     <w:uiPriority w:val="63"/>
@@ -7816,7 +7862,7 @@
       </w:tcPr>
     </w:tblStylePr>
   </w:style>
-  <w:style w:type="table" w:styleId="61">
+  <w:style w:type="table" w:styleId="62">
     <w:name w:val="Medium Shading 1 Accent 3"/>
     <w:basedOn w:val="12"/>
     <w:uiPriority w:val="63"/>
@@ -7923,7 +7969,7 @@
       </w:tcPr>
     </w:tblStylePr>
   </w:style>
-  <w:style w:type="table" w:styleId="62">
+  <w:style w:type="table" w:styleId="63">
     <w:name w:val="Medium Shading 1 Accent 4"/>
     <w:basedOn w:val="12"/>
     <w:uiPriority w:val="63"/>
@@ -8030,7 +8076,7 @@
       </w:tcPr>
     </w:tblStylePr>
   </w:style>
-  <w:style w:type="table" w:styleId="63">
+  <w:style w:type="table" w:styleId="64">
     <w:name w:val="Medium Shading 1 Accent 5"/>
     <w:basedOn w:val="12"/>
     <w:uiPriority w:val="63"/>
@@ -8137,7 +8183,7 @@
       </w:tcPr>
     </w:tblStylePr>
   </w:style>
-  <w:style w:type="table" w:styleId="64">
+  <w:style w:type="table" w:styleId="65">
     <w:name w:val="Medium Shading 1 Accent 6"/>
     <w:basedOn w:val="12"/>
     <w:uiPriority w:val="63"/>
@@ -8244,7 +8290,7 @@
       </w:tcPr>
     </w:tblStylePr>
   </w:style>
-  <w:style w:type="table" w:styleId="65">
+  <w:style w:type="table" w:styleId="66">
     <w:name w:val="Medium Shading 2"/>
     <w:basedOn w:val="12"/>
     <w:uiPriority w:val="64"/>
@@ -8409,7 +8455,7 @@
       </w:tcPr>
     </w:tblStylePr>
   </w:style>
-  <w:style w:type="table" w:styleId="66">
+  <w:style w:type="table" w:styleId="67">
     <w:name w:val="Medium Shading 2 Accent 1"/>
     <w:basedOn w:val="12"/>
     <w:uiPriority w:val="64"/>
@@ -8574,7 +8620,7 @@
       </w:tcPr>
     </w:tblStylePr>
   </w:style>
-  <w:style w:type="table" w:styleId="67">
+  <w:style w:type="table" w:styleId="68">
     <w:name w:val="Medium Shading 2 Accent 2"/>
     <w:basedOn w:val="12"/>
     <w:uiPriority w:val="64"/>
@@ -8739,7 +8785,7 @@
       </w:tcPr>
     </w:tblStylePr>
   </w:style>
-  <w:style w:type="table" w:styleId="68">
+  <w:style w:type="table" w:styleId="69">
     <w:name w:val="Medium Shading 2 Accent 3"/>
     <w:basedOn w:val="12"/>
     <w:uiPriority w:val="64"/>
@@ -8904,7 +8950,7 @@
       </w:tcPr>
     </w:tblStylePr>
   </w:style>
-  <w:style w:type="table" w:styleId="69">
+  <w:style w:type="table" w:styleId="70">
     <w:name w:val="Medium Shading 2 Accent 4"/>
     <w:basedOn w:val="12"/>
     <w:uiPriority w:val="64"/>
@@ -9069,7 +9115,7 @@
       </w:tcPr>
     </w:tblStylePr>
   </w:style>
-  <w:style w:type="table" w:styleId="70">
+  <w:style w:type="table" w:styleId="71">
     <w:name w:val="Medium Shading 2 Accent 5"/>
     <w:basedOn w:val="12"/>
     <w:uiPriority w:val="64"/>
@@ -9234,7 +9280,7 @@
       </w:tcPr>
     </w:tblStylePr>
   </w:style>
-  <w:style w:type="table" w:styleId="71">
+  <w:style w:type="table" w:styleId="72">
     <w:name w:val="Medium Shading 2 Accent 6"/>
     <w:basedOn w:val="12"/>
     <w:uiPriority w:val="64"/>
@@ -9399,7 +9445,7 @@
       </w:tcPr>
     </w:tblStylePr>
   </w:style>
-  <w:style w:type="table" w:styleId="72">
+  <w:style w:type="table" w:styleId="73">
     <w:name w:val="Medium List 1"/>
     <w:basedOn w:val="12"/>
     <w:uiPriority w:val="65"/>
@@ -9489,7 +9535,7 @@
       </w:tcPr>
     </w:tblStylePr>
   </w:style>
-  <w:style w:type="table" w:styleId="73">
+  <w:style w:type="table" w:styleId="74">
     <w:name w:val="Medium List 1 Accent 1"/>
     <w:basedOn w:val="12"/>
     <w:uiPriority w:val="65"/>
@@ -9579,7 +9625,7 @@
       </w:tcPr>
     </w:tblStylePr>
   </w:style>
-  <w:style w:type="table" w:styleId="74">
+  <w:style w:type="table" w:styleId="75">
     <w:name w:val="Medium List 1 Accent 2"/>
     <w:basedOn w:val="12"/>
     <w:uiPriority w:val="65"/>
@@ -9669,7 +9715,7 @@
       </w:tcPr>
     </w:tblStylePr>
   </w:style>
-  <w:style w:type="table" w:styleId="75">
+  <w:style w:type="table" w:styleId="76">
     <w:name w:val="Medium List 1 Accent 3"/>
     <w:basedOn w:val="12"/>
     <w:uiPriority w:val="65"/>
@@ -9759,7 +9805,7 @@
       </w:tcPr>
     </w:tblStylePr>
   </w:style>
-  <w:style w:type="table" w:styleId="76">
+  <w:style w:type="table" w:styleId="77">
     <w:name w:val="Medium List 1 Accent 4"/>
     <w:basedOn w:val="12"/>
     <w:uiPriority w:val="65"/>
@@ -9849,7 +9895,7 @@
       </w:tcPr>
     </w:tblStylePr>
   </w:style>
-  <w:style w:type="table" w:styleId="77">
+  <w:style w:type="table" w:styleId="78">
     <w:name w:val="Medium List 1 Accent 5"/>
     <w:basedOn w:val="12"/>
     <w:uiPriority w:val="65"/>
@@ -9939,7 +9985,7 @@
       </w:tcPr>
     </w:tblStylePr>
   </w:style>
-  <w:style w:type="table" w:styleId="78">
+  <w:style w:type="table" w:styleId="79">
     <w:name w:val="Medium List 1 Accent 6"/>
     <w:basedOn w:val="12"/>
     <w:uiPriority w:val="65"/>
@@ -10029,7 +10075,7 @@
       </w:tcPr>
     </w:tblStylePr>
   </w:style>
-  <w:style w:type="table" w:styleId="79">
+  <w:style w:type="table" w:styleId="80">
     <w:name w:val="Medium List 2"/>
     <w:basedOn w:val="12"/>
     <w:uiPriority w:val="66"/>
@@ -10158,7 +10204,7 @@
       </w:tcPr>
     </w:tblStylePr>
   </w:style>
-  <w:style w:type="table" w:styleId="80">
+  <w:style w:type="table" w:styleId="81">
     <w:name w:val="Medium List 2 Accent 1"/>
     <w:basedOn w:val="12"/>
     <w:uiPriority w:val="66"/>
@@ -10287,7 +10333,7 @@
       </w:tcPr>
     </w:tblStylePr>
   </w:style>
-  <w:style w:type="table" w:styleId="81">
+  <w:style w:type="table" w:styleId="82">
     <w:name w:val="Medium List 2 Accent 2"/>
     <w:basedOn w:val="12"/>
     <w:uiPriority w:val="66"/>
@@ -10416,7 +10462,7 @@
       </w:tcPr>
     </w:tblStylePr>
   </w:style>
-  <w:style w:type="table" w:styleId="82">
+  <w:style w:type="table" w:styleId="83">
     <w:name w:val="Medium List 2 Accent 3"/>
     <w:basedOn w:val="12"/>
     <w:uiPriority w:val="66"/>
@@ -10545,7 +10591,7 @@
       </w:tcPr>
     </w:tblStylePr>
   </w:style>
-  <w:style w:type="table" w:styleId="83">
+  <w:style w:type="table" w:styleId="84">
     <w:name w:val="Medium List 2 Accent 4"/>
     <w:basedOn w:val="12"/>
     <w:uiPriority w:val="66"/>
@@ -10674,7 +10720,7 @@
       </w:tcPr>
     </w:tblStylePr>
   </w:style>
-  <w:style w:type="table" w:styleId="84">
+  <w:style w:type="table" w:styleId="85">
     <w:name w:val="Medium List 2 Accent 5"/>
     <w:basedOn w:val="12"/>
     <w:uiPriority w:val="66"/>
@@ -10803,7 +10849,7 @@
       </w:tcPr>
     </w:tblStylePr>
   </w:style>
-  <w:style w:type="table" w:styleId="85">
+  <w:style w:type="table" w:styleId="86">
     <w:name w:val="Medium List 2 Accent 6"/>
     <w:basedOn w:val="12"/>
     <w:uiPriority w:val="66"/>
@@ -10932,7 +10978,7 @@
       </w:tcPr>
     </w:tblStylePr>
   </w:style>
-  <w:style w:type="table" w:styleId="86">
+  <w:style w:type="table" w:styleId="87">
     <w:name w:val="Medium Grid 1"/>
     <w:basedOn w:val="12"/>
     <w:uiPriority w:val="67"/>
@@ -11001,7 +11047,7 @@
       </w:tcPr>
     </w:tblStylePr>
   </w:style>
-  <w:style w:type="table" w:styleId="87">
+  <w:style w:type="table" w:styleId="88">
     <w:name w:val="Medium Grid 1 Accent 1"/>
     <w:basedOn w:val="12"/>
     <w:uiPriority w:val="67"/>
@@ -11070,7 +11116,7 @@
       </w:tcPr>
     </w:tblStylePr>
   </w:style>
-  <w:style w:type="table" w:styleId="88">
+  <w:style w:type="table" w:styleId="89">
     <w:name w:val="Medium Grid 1 Accent 2"/>
     <w:basedOn w:val="12"/>
     <w:uiPriority w:val="67"/>
@@ -11139,7 +11185,7 @@
       </w:tcPr>
     </w:tblStylePr>
   </w:style>
-  <w:style w:type="table" w:styleId="89">
+  <w:style w:type="table" w:styleId="90">
     <w:name w:val="Medium Grid 1 Accent 3"/>
     <w:basedOn w:val="12"/>
     <w:uiPriority w:val="67"/>
@@ -11208,7 +11254,7 @@
       </w:tcPr>
     </w:tblStylePr>
   </w:style>
-  <w:style w:type="table" w:styleId="90">
+  <w:style w:type="table" w:styleId="91">
     <w:name w:val="Medium Grid 1 Accent 4"/>
     <w:basedOn w:val="12"/>
     <w:uiPriority w:val="67"/>
@@ -11277,7 +11323,7 @@
       </w:tcPr>
     </w:tblStylePr>
   </w:style>
-  <w:style w:type="table" w:styleId="91">
+  <w:style w:type="table" w:styleId="92">
     <w:name w:val="Medium Grid 1 Accent 5"/>
     <w:basedOn w:val="12"/>
     <w:uiPriority w:val="67"/>
@@ -11346,7 +11392,7 @@
       </w:tcPr>
     </w:tblStylePr>
   </w:style>
-  <w:style w:type="table" w:styleId="92">
+  <w:style w:type="table" w:styleId="93">
     <w:name w:val="Medium Grid 1 Accent 6"/>
     <w:basedOn w:val="12"/>
     <w:uiPriority w:val="67"/>
@@ -11415,7 +11461,7 @@
       </w:tcPr>
     </w:tblStylePr>
   </w:style>
-  <w:style w:type="table" w:styleId="93">
+  <w:style w:type="table" w:styleId="94">
     <w:name w:val="Medium Grid 2"/>
     <w:basedOn w:val="12"/>
     <w:uiPriority w:val="68"/>
@@ -11561,7 +11607,7 @@
       </w:tcPr>
     </w:tblStylePr>
   </w:style>
-  <w:style w:type="table" w:styleId="94">
+  <w:style w:type="table" w:styleId="95">
     <w:name w:val="Medium Grid 2 Accent 1"/>
     <w:basedOn w:val="12"/>
     <w:uiPriority w:val="68"/>
@@ -11707,7 +11753,7 @@
       </w:tcPr>
     </w:tblStylePr>
   </w:style>
-  <w:style w:type="table" w:styleId="95">
+  <w:style w:type="table" w:styleId="96">
     <w:name w:val="Medium Grid 2 Accent 2"/>
     <w:basedOn w:val="12"/>
     <w:uiPriority w:val="68"/>
@@ -11853,7 +11899,7 @@
       </w:tcPr>
     </w:tblStylePr>
   </w:style>
-  <w:style w:type="table" w:styleId="96">
+  <w:style w:type="table" w:styleId="97">
     <w:name w:val="Medium Grid 2 Accent 3"/>
     <w:basedOn w:val="12"/>
     <w:uiPriority w:val="68"/>
@@ -11999,7 +12045,7 @@
       </w:tcPr>
     </w:tblStylePr>
   </w:style>
-  <w:style w:type="table" w:styleId="97">
+  <w:style w:type="table" w:styleId="98">
     <w:name w:val="Medium Grid 2 Accent 4"/>
     <w:basedOn w:val="12"/>
     <w:uiPriority w:val="68"/>
@@ -12145,7 +12191,7 @@
       </w:tcPr>
     </w:tblStylePr>
   </w:style>
-  <w:style w:type="table" w:styleId="98">
+  <w:style w:type="table" w:styleId="99">
     <w:name w:val="Medium Grid 2 Accent 5"/>
     <w:basedOn w:val="12"/>
     <w:uiPriority w:val="68"/>
@@ -12291,7 +12337,7 @@
       </w:tcPr>
     </w:tblStylePr>
   </w:style>
-  <w:style w:type="table" w:styleId="99">
+  <w:style w:type="table" w:styleId="100">
     <w:name w:val="Medium Grid 2 Accent 6"/>
     <w:basedOn w:val="12"/>
     <w:uiPriority w:val="68"/>
@@ -12437,7 +12483,7 @@
       </w:tcPr>
     </w:tblStylePr>
   </w:style>
-  <w:style w:type="table" w:styleId="100">
+  <w:style w:type="table" w:styleId="101">
     <w:name w:val="Medium Grid 3"/>
     <w:basedOn w:val="12"/>
     <w:uiPriority w:val="69"/>
@@ -12594,7 +12640,7 @@
       </w:tcPr>
     </w:tblStylePr>
   </w:style>
-  <w:style w:type="table" w:styleId="101">
+  <w:style w:type="table" w:styleId="102">
     <w:name w:val="Medium Grid 3 Accent 1"/>
     <w:basedOn w:val="12"/>
     <w:uiPriority w:val="69"/>
@@ -12751,7 +12797,7 @@
       </w:tcPr>
     </w:tblStylePr>
   </w:style>
-  <w:style w:type="table" w:styleId="102">
+  <w:style w:type="table" w:styleId="103">
     <w:name w:val="Medium Grid 3 Accent 2"/>
     <w:basedOn w:val="12"/>
     <w:uiPriority w:val="69"/>
@@ -12908,7 +12954,7 @@
       </w:tcPr>
     </w:tblStylePr>
   </w:style>
-  <w:style w:type="table" w:styleId="103">
+  <w:style w:type="table" w:styleId="104">
     <w:name w:val="Medium Grid 3 Accent 3"/>
     <w:basedOn w:val="12"/>
     <w:uiPriority w:val="69"/>
@@ -13065,7 +13111,7 @@
       </w:tcPr>
     </w:tblStylePr>
   </w:style>
-  <w:style w:type="table" w:styleId="104">
+  <w:style w:type="table" w:styleId="105">
     <w:name w:val="Medium Grid 3 Accent 4"/>
     <w:basedOn w:val="12"/>
     <w:uiPriority w:val="69"/>
@@ -13222,7 +13268,7 @@
       </w:tcPr>
     </w:tblStylePr>
   </w:style>
-  <w:style w:type="table" w:styleId="105">
+  <w:style w:type="table" w:styleId="106">
     <w:name w:val="Medium Grid 3 Accent 5"/>
     <w:basedOn w:val="12"/>
     <w:uiPriority w:val="69"/>
@@ -13379,7 +13425,7 @@
       </w:tcPr>
     </w:tblStylePr>
   </w:style>
-  <w:style w:type="table" w:styleId="106">
+  <w:style w:type="table" w:styleId="107">
     <w:name w:val="Medium Grid 3 Accent 6"/>
     <w:basedOn w:val="12"/>
     <w:uiPriority w:val="69"/>
@@ -13536,7 +13582,7 @@
       </w:tcPr>
     </w:tblStylePr>
   </w:style>
-  <w:style w:type="table" w:styleId="107">
+  <w:style w:type="table" w:styleId="108">
     <w:name w:val="Dark List"/>
     <w:basedOn w:val="12"/>
     <w:uiPriority w:val="70"/>
@@ -13651,7 +13697,7 @@
       </w:tcPr>
     </w:tblStylePr>
   </w:style>
-  <w:style w:type="table" w:styleId="108">
+  <w:style w:type="table" w:styleId="109">
     <w:name w:val="Dark List Accent 1"/>
     <w:basedOn w:val="12"/>
     <w:uiPriority w:val="70"/>
@@ -13766,7 +13812,7 @@
       </w:tcPr>
     </w:tblStylePr>
   </w:style>
-  <w:style w:type="table" w:styleId="109">
+  <w:style w:type="table" w:styleId="110">
     <w:name w:val="Dark List Accent 2"/>
     <w:basedOn w:val="12"/>
     <w:uiPriority w:val="70"/>
@@ -13881,7 +13927,7 @@
       </w:tcPr>
     </w:tblStylePr>
   </w:style>
-  <w:style w:type="table" w:styleId="110">
+  <w:style w:type="table" w:styleId="111">
     <w:name w:val="Dark List Accent 3"/>
     <w:basedOn w:val="12"/>
     <w:uiPriority w:val="70"/>
@@ -13996,7 +14042,7 @@
       </w:tcPr>
     </w:tblStylePr>
   </w:style>
-  <w:style w:type="table" w:styleId="111">
+  <w:style w:type="table" w:styleId="112">
     <w:name w:val="Dark List Accent 4"/>
     <w:basedOn w:val="12"/>
     <w:uiPriority w:val="70"/>
@@ -14111,7 +14157,7 @@
       </w:tcPr>
     </w:tblStylePr>
   </w:style>
-  <w:style w:type="table" w:styleId="112">
+  <w:style w:type="table" w:styleId="113">
     <w:name w:val="Dark List Accent 5"/>
     <w:basedOn w:val="12"/>
     <w:uiPriority w:val="70"/>
@@ -14226,7 +14272,7 @@
       </w:tcPr>
     </w:tblStylePr>
   </w:style>
-  <w:style w:type="table" w:styleId="113">
+  <w:style w:type="table" w:styleId="114">
     <w:name w:val="Dark List Accent 6"/>
     <w:basedOn w:val="12"/>
     <w:uiPriority w:val="70"/>
@@ -14341,7 +14387,7 @@
       </w:tcPr>
     </w:tblStylePr>
   </w:style>
-  <w:style w:type="table" w:styleId="114">
+  <w:style w:type="table" w:styleId="115">
     <w:name w:val="Colorful Shading"/>
     <w:basedOn w:val="12"/>
     <w:uiPriority w:val="71"/>
@@ -14489,7 +14535,7 @@
       </w:rPr>
     </w:tblStylePr>
   </w:style>
-  <w:style w:type="table" w:styleId="115">
+  <w:style w:type="table" w:styleId="116">
     <w:name w:val="Colorful Shading Accent 1"/>
     <w:basedOn w:val="12"/>
     <w:uiPriority w:val="71"/>
@@ -14637,7 +14683,7 @@
       </w:rPr>
     </w:tblStylePr>
   </w:style>
-  <w:style w:type="table" w:styleId="116">
+  <w:style w:type="table" w:styleId="117">
     <w:name w:val="Colorful Shading Accent 2"/>
     <w:basedOn w:val="12"/>
     <w:uiPriority w:val="71"/>
@@ -14785,7 +14831,7 @@
       </w:rPr>
     </w:tblStylePr>
   </w:style>
-  <w:style w:type="table" w:styleId="117">
+  <w:style w:type="table" w:styleId="118">
     <w:name w:val="Colorful Shading Accent 3"/>
     <w:basedOn w:val="12"/>
     <w:uiPriority w:val="71"/>
@@ -14913,7 +14959,7 @@
       </w:tcPr>
     </w:tblStylePr>
   </w:style>
-  <w:style w:type="table" w:styleId="118">
+  <w:style w:type="table" w:styleId="119">
     <w:name w:val="Colorful Shading Accent 4"/>
     <w:basedOn w:val="12"/>
     <w:uiPriority w:val="71"/>
@@ -15061,7 +15107,7 @@
       </w:rPr>
     </w:tblStylePr>
   </w:style>
-  <w:style w:type="table" w:styleId="119">
+  <w:style w:type="table" w:styleId="120">
     <w:name w:val="Colorful Shading Accent 5"/>
     <w:basedOn w:val="12"/>
     <w:uiPriority w:val="71"/>
@@ -15209,7 +15255,7 @@
       </w:rPr>
     </w:tblStylePr>
   </w:style>
-  <w:style w:type="table" w:styleId="120">
+  <w:style w:type="table" w:styleId="121">
     <w:name w:val="Colorful Shading Accent 6"/>
     <w:basedOn w:val="12"/>
     <w:uiPriority w:val="71"/>
@@ -15357,7 +15403,7 @@
       </w:rPr>
     </w:tblStylePr>
   </w:style>
-  <w:style w:type="table" w:styleId="121">
+  <w:style w:type="table" w:styleId="122">
     <w:name w:val="Colorful List"/>
     <w:basedOn w:val="12"/>
     <w:uiPriority w:val="72"/>
@@ -15449,7 +15495,7 @@
       </w:tcPr>
     </w:tblStylePr>
   </w:style>
-  <w:style w:type="table" w:styleId="122">
+  <w:style w:type="table" w:styleId="123">
     <w:name w:val="Colorful List Accent 1"/>
     <w:basedOn w:val="12"/>
     <w:uiPriority w:val="72"/>
@@ -15541,7 +15587,7 @@
       </w:tcPr>
     </w:tblStylePr>
   </w:style>
-  <w:style w:type="table" w:styleId="123">
+  <w:style w:type="table" w:styleId="124">
     <w:name w:val="Colorful List Accent 2"/>
     <w:basedOn w:val="12"/>
     <w:uiPriority w:val="72"/>
@@ -15633,7 +15679,7 @@
       </w:tcPr>
     </w:tblStylePr>
   </w:style>
-  <w:style w:type="table" w:styleId="124">
+  <w:style w:type="table" w:styleId="125">
     <w:name w:val="Colorful List Accent 3"/>
     <w:basedOn w:val="12"/>
     <w:uiPriority w:val="72"/>
@@ -15725,7 +15771,7 @@
       </w:tcPr>
     </w:tblStylePr>
   </w:style>
-  <w:style w:type="table" w:styleId="125">
+  <w:style w:type="table" w:styleId="126">
     <w:name w:val="Colorful List Accent 4"/>
     <w:basedOn w:val="12"/>
     <w:uiPriority w:val="72"/>
@@ -15817,7 +15863,7 @@
       </w:tcPr>
     </w:tblStylePr>
   </w:style>
-  <w:style w:type="table" w:styleId="126">
+  <w:style w:type="table" w:styleId="127">
     <w:name w:val="Colorful List Accent 5"/>
     <w:basedOn w:val="12"/>
     <w:uiPriority w:val="72"/>
@@ -15909,7 +15955,7 @@
       </w:tcPr>
     </w:tblStylePr>
   </w:style>
-  <w:style w:type="table" w:styleId="127">
+  <w:style w:type="table" w:styleId="128">
     <w:name w:val="Colorful List Accent 6"/>
     <w:basedOn w:val="12"/>
     <w:uiPriority w:val="72"/>
@@ -16001,7 +16047,7 @@
       </w:tcPr>
     </w:tblStylePr>
   </w:style>
-  <w:style w:type="table" w:styleId="128">
+  <w:style w:type="table" w:styleId="129">
     <w:name w:val="Colorful Grid"/>
     <w:basedOn w:val="12"/>
     <w:uiPriority w:val="73"/>
@@ -16097,7 +16143,7 @@
       </w:tcPr>
     </w:tblStylePr>
   </w:style>
-  <w:style w:type="table" w:styleId="129">
+  <w:style w:type="table" w:styleId="130">
     <w:name w:val="Colorful Grid Accent 1"/>
     <w:basedOn w:val="12"/>
     <w:uiPriority w:val="73"/>
@@ -16193,7 +16239,7 @@
       </w:tcPr>
     </w:tblStylePr>
   </w:style>
-  <w:style w:type="table" w:styleId="130">
+  <w:style w:type="table" w:styleId="131">
     <w:name w:val="Colorful Grid Accent 2"/>
     <w:basedOn w:val="12"/>
     <w:uiPriority w:val="73"/>
@@ -16289,7 +16335,7 @@
       </w:tcPr>
     </w:tblStylePr>
   </w:style>
-  <w:style w:type="table" w:styleId="131">
+  <w:style w:type="table" w:styleId="132">
     <w:name w:val="Colorful Grid Accent 3"/>
     <w:basedOn w:val="12"/>
     <w:uiPriority w:val="73"/>
@@ -16385,7 +16431,7 @@
       </w:tcPr>
     </w:tblStylePr>
   </w:style>
-  <w:style w:type="table" w:styleId="132">
+  <w:style w:type="table" w:styleId="133">
     <w:name w:val="Colorful Grid Accent 4"/>
     <w:basedOn w:val="12"/>
     <w:uiPriority w:val="73"/>
@@ -16481,7 +16527,7 @@
       </w:tcPr>
     </w:tblStylePr>
   </w:style>
-  <w:style w:type="table" w:styleId="133">
+  <w:style w:type="table" w:styleId="134">
     <w:name w:val="Colorful Grid Accent 5"/>
     <w:basedOn w:val="12"/>
     <w:uiPriority w:val="73"/>
@@ -16577,7 +16623,7 @@
       </w:tcPr>
     </w:tblStylePr>
   </w:style>
-  <w:style w:type="table" w:styleId="134">
+  <w:style w:type="table" w:styleId="135">
     <w:name w:val="Colorful Grid Accent 6"/>
     <w:basedOn w:val="12"/>
     <w:uiPriority w:val="73"/>
@@ -16673,21 +16719,21 @@
       </w:tcPr>
     </w:tblStylePr>
   </w:style>
-  <w:style w:type="character" w:customStyle="1" w:styleId="135">
+  <w:style w:type="character" w:customStyle="1" w:styleId="136">
     <w:name w:val="Header Char"/>
     <w:basedOn w:val="11"/>
     <w:link w:val="19"/>
     <w:qFormat/>
     <w:uiPriority w:val="99"/>
   </w:style>
-  <w:style w:type="character" w:customStyle="1" w:styleId="136">
+  <w:style w:type="character" w:customStyle="1" w:styleId="137">
     <w:name w:val="Footer Char"/>
     <w:basedOn w:val="11"/>
     <w:link w:val="18"/>
     <w:qFormat/>
     <w:uiPriority w:val="99"/>
   </w:style>
-  <w:style w:type="paragraph" w:styleId="137">
+  <w:style w:type="paragraph" w:styleId="138">
     <w:name w:val="No Spacing"/>
     <w:qFormat/>
     <w:uiPriority w:val="1"/>
@@ -16701,7 +16747,7 @@
       <w:lang w:val="en-US" w:eastAsia="en-US" w:bidi="ar-SA"/>
     </w:rPr>
   </w:style>
-  <w:style w:type="character" w:customStyle="1" w:styleId="138">
+  <w:style w:type="character" w:customStyle="1" w:styleId="139">
     <w:name w:val="Heading 1 Char"/>
     <w:basedOn w:val="11"/>
     <w:link w:val="2"/>
@@ -16716,7 +16762,7 @@
       <w:szCs w:val="28"/>
     </w:rPr>
   </w:style>
-  <w:style w:type="character" w:customStyle="1" w:styleId="139">
+  <w:style w:type="character" w:customStyle="1" w:styleId="140">
     <w:name w:val="Heading 2 Char"/>
     <w:basedOn w:val="11"/>
     <w:link w:val="3"/>
@@ -16736,7 +16782,7 @@
       </w14:textFill>
     </w:rPr>
   </w:style>
-  <w:style w:type="character" w:customStyle="1" w:styleId="140">
+  <w:style w:type="character" w:customStyle="1" w:styleId="141">
     <w:name w:val="Heading 3 Char"/>
     <w:basedOn w:val="11"/>
     <w:link w:val="4"/>
@@ -16754,10 +16800,10 @@
       </w14:textFill>
     </w:rPr>
   </w:style>
-  <w:style w:type="character" w:customStyle="1" w:styleId="141">
+  <w:style w:type="character" w:customStyle="1" w:styleId="142">
     <w:name w:val="Title Char"/>
     <w:basedOn w:val="11"/>
-    <w:link w:val="36"/>
+    <w:link w:val="37"/>
     <w:qFormat/>
     <w:uiPriority w:val="10"/>
     <w:rPr>
@@ -16769,10 +16815,10 @@
       <w:szCs w:val="52"/>
     </w:rPr>
   </w:style>
-  <w:style w:type="character" w:customStyle="1" w:styleId="142">
+  <w:style w:type="character" w:customStyle="1" w:styleId="143">
     <w:name w:val="Subtitle Char"/>
     <w:basedOn w:val="11"/>
-    <w:link w:val="34"/>
+    <w:link w:val="35"/>
     <w:qFormat/>
     <w:uiPriority w:val="11"/>
     <w:rPr>
@@ -16790,7 +16836,7 @@
       </w14:textFill>
     </w:rPr>
   </w:style>
-  <w:style w:type="paragraph" w:styleId="143">
+  <w:style w:type="paragraph" w:styleId="144">
     <w:name w:val="List Paragraph"/>
     <w:basedOn w:val="1"/>
     <w:qFormat/>
@@ -16800,20 +16846,20 @@
       <w:contextualSpacing/>
     </w:pPr>
   </w:style>
-  <w:style w:type="character" w:customStyle="1" w:styleId="144">
+  <w:style w:type="character" w:customStyle="1" w:styleId="145">
     <w:name w:val="Body Text Char"/>
     <w:basedOn w:val="11"/>
     <w:link w:val="13"/>
     <w:qFormat/>
     <w:uiPriority w:val="99"/>
   </w:style>
-  <w:style w:type="character" w:customStyle="1" w:styleId="145">
+  <w:style w:type="character" w:customStyle="1" w:styleId="146">
     <w:name w:val="Body Text 2 Char"/>
     <w:basedOn w:val="11"/>
     <w:link w:val="14"/>
     <w:uiPriority w:val="99"/>
   </w:style>
-  <w:style w:type="character" w:customStyle="1" w:styleId="146">
+  <w:style w:type="character" w:customStyle="1" w:styleId="147">
     <w:name w:val="Body Text 3 Char"/>
     <w:basedOn w:val="11"/>
     <w:link w:val="15"/>
@@ -16823,10 +16869,10 @@
       <w:szCs w:val="16"/>
     </w:rPr>
   </w:style>
-  <w:style w:type="character" w:customStyle="1" w:styleId="147">
+  <w:style w:type="character" w:customStyle="1" w:styleId="148">
     <w:name w:val="Macro Text Char"/>
     <w:basedOn w:val="11"/>
-    <w:link w:val="32"/>
+    <w:link w:val="33"/>
     <w:uiPriority w:val="99"/>
     <w:rPr>
       <w:rFonts w:ascii="Courier" w:hAnsi="Courier"/>
@@ -16834,11 +16880,11 @@
       <w:szCs w:val="20"/>
     </w:rPr>
   </w:style>
-  <w:style w:type="paragraph" w:styleId="148">
+  <w:style w:type="paragraph" w:styleId="149">
     <w:name w:val="Quote"/>
     <w:basedOn w:val="1"/>
     <w:next w:val="1"/>
-    <w:link w:val="149"/>
+    <w:link w:val="150"/>
     <w:qFormat/>
     <w:uiPriority w:val="29"/>
     <w:rPr>
@@ -16852,10 +16898,10 @@
       </w14:textFill>
     </w:rPr>
   </w:style>
-  <w:style w:type="character" w:customStyle="1" w:styleId="149">
+  <w:style w:type="character" w:customStyle="1" w:styleId="150">
     <w:name w:val="Quote Char"/>
     <w:basedOn w:val="11"/>
-    <w:link w:val="148"/>
+    <w:link w:val="149"/>
     <w:uiPriority w:val="29"/>
     <w:rPr>
       <w:i/>
@@ -16868,7 +16914,7 @@
       </w14:textFill>
     </w:rPr>
   </w:style>
-  <w:style w:type="character" w:customStyle="1" w:styleId="150">
+  <w:style w:type="character" w:customStyle="1" w:styleId="151">
     <w:name w:val="Heading 4 Char"/>
     <w:basedOn w:val="11"/>
     <w:link w:val="5"/>
@@ -16888,7 +16934,7 @@
       </w14:textFill>
     </w:rPr>
   </w:style>
-  <w:style w:type="character" w:customStyle="1" w:styleId="151">
+  <w:style w:type="character" w:customStyle="1" w:styleId="152">
     <w:name w:val="Heading 5 Char"/>
     <w:basedOn w:val="11"/>
     <w:link w:val="6"/>
@@ -16899,7 +16945,7 @@
       <w:color w:val="254061" w:themeColor="accent1" w:themeShade="80"/>
     </w:rPr>
   </w:style>
-  <w:style w:type="character" w:customStyle="1" w:styleId="152">
+  <w:style w:type="character" w:customStyle="1" w:styleId="153">
     <w:name w:val="Heading 6 Char"/>
     <w:basedOn w:val="11"/>
     <w:link w:val="7"/>
@@ -16912,7 +16958,7 @@
       <w:color w:val="254061" w:themeColor="accent1" w:themeShade="80"/>
     </w:rPr>
   </w:style>
-  <w:style w:type="character" w:customStyle="1" w:styleId="153">
+  <w:style w:type="character" w:customStyle="1" w:styleId="154">
     <w:name w:val="Heading 7 Char"/>
     <w:basedOn w:val="11"/>
     <w:link w:val="8"/>
@@ -16933,7 +16979,7 @@
       </w14:textFill>
     </w:rPr>
   </w:style>
-  <w:style w:type="character" w:customStyle="1" w:styleId="154">
+  <w:style w:type="character" w:customStyle="1" w:styleId="155">
     <w:name w:val="Heading 8 Char"/>
     <w:basedOn w:val="11"/>
     <w:link w:val="9"/>
@@ -16951,7 +16997,7 @@
       </w14:textFill>
     </w:rPr>
   </w:style>
-  <w:style w:type="character" w:customStyle="1" w:styleId="155">
+  <w:style w:type="character" w:customStyle="1" w:styleId="156">
     <w:name w:val="Heading 9 Char"/>
     <w:basedOn w:val="11"/>
     <w:link w:val="10"/>
@@ -16974,11 +17020,11 @@
       </w14:textFill>
     </w:rPr>
   </w:style>
-  <w:style w:type="paragraph" w:styleId="156">
+  <w:style w:type="paragraph" w:styleId="157">
     <w:name w:val="Intense Quote"/>
     <w:basedOn w:val="1"/>
     <w:next w:val="1"/>
-    <w:link w:val="157"/>
+    <w:link w:val="158"/>
     <w:qFormat/>
     <w:uiPriority w:val="30"/>
     <w:pPr>
@@ -17001,10 +17047,10 @@
       </w14:textFill>
     </w:rPr>
   </w:style>
-  <w:style w:type="character" w:customStyle="1" w:styleId="157">
+  <w:style w:type="character" w:customStyle="1" w:styleId="158">
     <w:name w:val="Intense Quote Char"/>
     <w:basedOn w:val="11"/>
-    <w:link w:val="156"/>
+    <w:link w:val="157"/>
     <w:uiPriority w:val="30"/>
     <w:rPr>
       <w:b/>
@@ -17019,7 +17065,7 @@
       </w14:textFill>
     </w:rPr>
   </w:style>
-  <w:style w:type="character" w:customStyle="1" w:styleId="158">
+  <w:style w:type="character" w:customStyle="1" w:styleId="159">
     <w:name w:val="Subtle Emphasis"/>
     <w:basedOn w:val="11"/>
     <w:qFormat/>
@@ -17038,7 +17084,7 @@
       </w14:textFill>
     </w:rPr>
   </w:style>
-  <w:style w:type="character" w:customStyle="1" w:styleId="159">
+  <w:style w:type="character" w:customStyle="1" w:styleId="160">
     <w:name w:val="Intense Emphasis"/>
     <w:basedOn w:val="11"/>
     <w:qFormat/>
@@ -17056,7 +17102,7 @@
       </w14:textFill>
     </w:rPr>
   </w:style>
-  <w:style w:type="character" w:customStyle="1" w:styleId="160">
+  <w:style w:type="character" w:customStyle="1" w:styleId="161">
     <w:name w:val="Subtle Reference"/>
     <w:basedOn w:val="11"/>
     <w:qFormat/>
@@ -17072,7 +17118,7 @@
       </w14:textFill>
     </w:rPr>
   </w:style>
-  <w:style w:type="character" w:customStyle="1" w:styleId="161">
+  <w:style w:type="character" w:customStyle="1" w:styleId="162">
     <w:name w:val="Intense Reference"/>
     <w:basedOn w:val="11"/>
     <w:qFormat/>
@@ -17091,7 +17137,7 @@
       </w14:textFill>
     </w:rPr>
   </w:style>
-  <w:style w:type="character" w:customStyle="1" w:styleId="162">
+  <w:style w:type="character" w:customStyle="1" w:styleId="163">
     <w:name w:val="Book Title"/>
     <w:basedOn w:val="11"/>
     <w:qFormat/>
@@ -17103,7 +17149,7 @@
       <w:spacing w:val="5"/>
     </w:rPr>
   </w:style>
-  <w:style w:type="paragraph" w:customStyle="1" w:styleId="163">
+  <w:style w:type="paragraph" w:customStyle="1" w:styleId="164">
     <w:name w:val="TOC Heading"/>
     <w:basedOn w:val="2"/>
     <w:next w:val="1"/>

</xml_diff>